<commit_message>
remove VM, update references and blurb about first year CV
</commit_message>
<xml_diff>
--- a/_book/latex4year1.docx
+++ b/_book/latex4year1.docx
@@ -23,10 +23,10 @@
         <w:pStyle w:val="Date"/>
       </w:pPr>
       <w:r>
-        <w:t xml:space="preserve">Last updated on 13 January, 2026</w:t>
-      </w:r>
-    </w:p>
-    <w:bookmarkStart w:id="38" w:name="welcome"/>
+        <w:t xml:space="preserve">Last updated on 22 September, 2026</w:t>
+      </w:r>
+    </w:p>
+    <w:bookmarkStart w:id="27" w:name="welcome"/>
     <w:p>
       <w:pPr>
         <w:pStyle w:val="Heading1"/>
@@ -52,18 +52,18 @@
           <wp:inline>
             <wp:extent cx="4800600" cy="1824228"/>
             <wp:effectExtent b="0" l="0" r="0" t="0"/>
-            <wp:docPr descr="Figure 0.1: The LaTeX project logo by Jonas Jacek CC BY 4.0 via Wikimedia Commons w.wiki/3Daw" title="" id="21" name="Picture"/>
+            <wp:docPr descr="Figure 0.1: The LaTeX project logo by Jonas Jacek CC BY 4.0 via Wikimedia Commons w.wiki/3Daw" title="" id="10" name="Picture"/>
             <a:graphic>
               <a:graphicData uri="http://schemas.openxmlformats.org/drawingml/2006/picture">
                 <pic:pic>
                   <pic:nvPicPr>
-                    <pic:cNvPr descr="images/1000px-LaTeX_project_logo_bird.svg.png" id="22" name="Picture"/>
+                    <pic:cNvPr descr="images/1000px-LaTeX_project_logo_bird.svg.png" id="11" name="Picture"/>
                     <pic:cNvPicPr>
                       <a:picLocks noChangeArrowheads="1" noChangeAspect="1"/>
                     </pic:cNvPicPr>
                   </pic:nvPicPr>
                   <pic:blipFill>
-                    <a:blip r:embed="rId20"/>
+                    <a:blip r:embed="rId9"/>
                     <a:stretch>
                       <a:fillRect/>
                     </a:stretch>
@@ -94,15 +94,15 @@
       <w:pPr>
         <w:pStyle w:val="ImageCaption"/>
       </w:pPr>
-      <w:bookmarkStart w:id="23" w:name="fig:latexproject-fig"/>
-      <w:bookmarkEnd w:id="23"/>
+      <w:bookmarkStart w:id="12" w:name="fig:latexproject-fig"/>
+      <w:bookmarkEnd w:id="12"/>
       <w:r>
         <w:t xml:space="preserve">Figure 0.1: The LaTeX project logo by</w:t>
       </w:r>
       <w:r>
         <w:t xml:space="preserve"> </w:t>
       </w:r>
-      <w:hyperlink r:id="rId24">
+      <w:hyperlink r:id="rId13">
         <w:r>
           <w:rPr>
             <w:rStyle w:val="Hyperlink"/>
@@ -119,7 +119,7 @@
       <w:r>
         <w:t xml:space="preserve"> </w:t>
       </w:r>
-      <w:hyperlink r:id="rId25">
+      <w:hyperlink r:id="rId14">
         <w:r>
           <w:rPr>
             <w:rStyle w:val="Hyperlink"/>
@@ -196,7 +196,7 @@
         <w:t xml:space="preserve">Draft a CV using LaTeX templates</w:t>
       </w:r>
     </w:p>
-    <w:bookmarkStart w:id="31" w:name="acknowledgements"/>
+    <w:bookmarkStart w:id="20" w:name="acknowledgements"/>
     <w:p>
       <w:pPr>
         <w:pStyle w:val="Heading2"/>
@@ -215,7 +215,7 @@
       <w:r>
         <w:t xml:space="preserve"> </w:t>
       </w:r>
-      <w:hyperlink r:id="rId26">
+      <w:hyperlink r:id="rId15">
         <w:r>
           <w:rPr>
             <w:rStyle w:val="Hyperlink"/>
@@ -229,7 +229,7 @@
       <w:r>
         <w:t xml:space="preserve"> </w:t>
       </w:r>
-      <w:hyperlink r:id="rId27">
+      <w:hyperlink r:id="rId16">
         <w:r>
           <w:rPr>
             <w:rStyle w:val="Hyperlink"/>
@@ -243,7 +243,7 @@
       <w:r>
         <w:t xml:space="preserve"> </w:t>
       </w:r>
-      <w:hyperlink r:id="rId28">
+      <w:hyperlink r:id="rId17">
         <w:r>
           <w:rPr>
             <w:rStyle w:val="Hyperlink"/>
@@ -257,7 +257,7 @@
       <w:r>
         <w:t xml:space="preserve"> </w:t>
       </w:r>
-      <w:hyperlink r:id="rId29">
+      <w:hyperlink r:id="rId18">
         <w:r>
           <w:rPr>
             <w:rStyle w:val="Hyperlink"/>
@@ -274,7 +274,7 @@
       <w:r>
         <w:t xml:space="preserve"> </w:t>
       </w:r>
-      <w:hyperlink r:id="rId30">
+      <w:hyperlink r:id="rId19">
         <w:r>
           <w:rPr>
             <w:rStyle w:val="Hyperlink"/>
@@ -286,8 +286,8 @@
         <w:t xml:space="preserve">.</w:t>
       </w:r>
     </w:p>
-    <w:bookmarkEnd w:id="31"/>
-    <w:bookmarkStart w:id="37" w:name="improve-this-manual"/>
+    <w:bookmarkEnd w:id="20"/>
+    <w:bookmarkStart w:id="26" w:name="improve-this-manual"/>
     <w:p>
       <w:pPr>
         <w:pStyle w:val="Heading2"/>
@@ -306,7 +306,7 @@
       <w:r>
         <w:t xml:space="preserve"> </w:t>
       </w:r>
-      <w:hyperlink r:id="rId32">
+      <w:hyperlink r:id="rId21">
         <w:r>
           <w:rPr>
             <w:rStyle w:val="Hyperlink"/>
@@ -323,7 +323,7 @@
       <w:r>
         <w:t xml:space="preserve"> </w:t>
       </w:r>
-      <w:hyperlink r:id="rId33">
+      <w:hyperlink r:id="rId22">
         <w:r>
           <w:rPr>
             <w:rStyle w:val="Hyperlink"/>
@@ -342,7 +342,7 @@
       <w:r>
         <w:t xml:space="preserve">Thanks to contributions from Hamza Latif (</w:t>
       </w:r>
-      <w:hyperlink r:id="rId34">
+      <w:hyperlink r:id="rId23">
         <w:r>
           <w:rPr>
             <w:rStyle w:val="Hyperlink"/>
@@ -353,7 +353,7 @@
       <w:r>
         <w:t xml:space="preserve">) and Saurav Maheshkar (</w:t>
       </w:r>
-      <w:hyperlink r:id="rId35">
+      <w:hyperlink r:id="rId24">
         <w:r>
           <w:rPr>
             <w:rStyle w:val="Hyperlink"/>
@@ -391,7 +391,7 @@
       <w:r>
         <w:t xml:space="preserve"> </w:t>
       </w:r>
-      <w:hyperlink r:id="rId36">
+      <w:hyperlink r:id="rId25">
         <w:r>
           <w:rPr>
             <w:rStyle w:val="Hyperlink"/>
@@ -406,9 +406,9 @@
         <w:t xml:space="preserve">directly.</w:t>
       </w:r>
     </w:p>
-    <w:bookmarkEnd w:id="37"/>
-    <w:bookmarkEnd w:id="38"/>
-    <w:bookmarkStart w:id="54" w:name="latex"/>
+    <w:bookmarkEnd w:id="26"/>
+    <w:bookmarkEnd w:id="27"/>
+    <w:bookmarkStart w:id="43" w:name="latex"/>
     <w:p>
       <w:pPr>
         <w:pStyle w:val="Heading1"/>
@@ -482,7 +482,7 @@
       <w:r>
         <w:t xml:space="preserve"> </w:t>
       </w:r>
-      <w:hyperlink r:id="rId39">
+      <w:hyperlink r:id="rId28">
         <w:r>
           <w:rPr>
             <w:rStyle w:val="Hyperlink"/>
@@ -502,7 +502,7 @@
       <w:r>
         <w:t xml:space="preserve"> </w:t>
       </w:r>
-      <w:hyperlink r:id="rId40">
+      <w:hyperlink r:id="rId29">
         <w:r>
           <w:rPr>
             <w:rStyle w:val="Hyperlink"/>
@@ -519,7 +519,7 @@
       <w:r>
         <w:t xml:space="preserve"> </w:t>
       </w:r>
-      <w:hyperlink r:id="rId41">
+      <w:hyperlink r:id="rId30">
         <w:r>
           <w:rPr>
             <w:rStyle w:val="Hyperlink"/>
@@ -533,7 +533,7 @@
       <w:r>
         <w:t xml:space="preserve"> </w:t>
       </w:r>
-      <w:hyperlink r:id="rId42">
+      <w:hyperlink r:id="rId31">
         <w:r>
           <w:rPr>
             <w:rStyle w:val="Hyperlink"/>
@@ -566,18 +566,18 @@
           <wp:inline>
             <wp:extent cx="2506980" cy="2961143"/>
             <wp:effectExtent b="0" l="0" r="0" t="0"/>
-            <wp:docPr descr="Figure 1.1: Turing award winners Leslie Lamport and Donald Knuth created TeX and LaTeX during the 1980’s. Lamport portrait by Leslie Lamport, GFDL via Wikimedia Commons w.wiki/3Daz, Knuth portrait by Jacob Appelbaum CC BY-SA via Wikimedia Commons w.wiki/3Day. Is Donald Knuth the The Yoda of Silicon Valley? (Roberts 2018)" title="" id="44" name="Picture"/>
+            <wp:docPr descr="Figure 1.1: Turing award winners Leslie Lamport and Donald Knuth created TeX and LaTeX during the 1980’s. Lamport portrait by Leslie Lamport, GFDL via Wikimedia Commons w.wiki/3Daz, Knuth portrait by Jacob Appelbaum CC BY-SA via Wikimedia Commons w.wiki/3Day. Is Donald Knuth the The Yoda of Silicon Valley? (Roberts 2018)" title="" id="33" name="Picture"/>
             <a:graphic>
               <a:graphicData uri="http://schemas.openxmlformats.org/drawingml/2006/picture">
                 <pic:pic>
                   <pic:nvPicPr>
-                    <pic:cNvPr descr="images/Leslie_Lamport.jpg" id="45" name="Picture"/>
+                    <pic:cNvPr descr="images/Leslie_Lamport.jpg" id="34" name="Picture"/>
                     <pic:cNvPicPr>
                       <a:picLocks noChangeArrowheads="1" noChangeAspect="1"/>
                     </pic:cNvPicPr>
                   </pic:nvPicPr>
                   <pic:blipFill>
-                    <a:blip r:embed="rId43"/>
+                    <a:blip r:embed="rId32"/>
                     <a:stretch>
                       <a:fillRect/>
                     </a:stretch>
@@ -608,18 +608,18 @@
           <wp:inline>
             <wp:extent cx="2506980" cy="2964929"/>
             <wp:effectExtent b="0" l="0" r="0" t="0"/>
-            <wp:docPr descr="(#fig:knuthport-fig)Turing award winners Leslie Lamport and Donald Knuth created TeX and LaTeX during the 1980’s. Lamport portrait by Leslie Lamport, GFDL via Wikimedia Commons w.wiki/3Daz, Knuth portrait by Jacob Appelbaum CC BY-SA via Wikimedia Commons w.wiki/3Day. Is Donald Knuth the The Yoda of Silicon Valley? (Roberts 2018)" title="" id="47" name="Picture"/>
+            <wp:docPr descr="(#fig:knuthport-fig)Turing award winners Leslie Lamport and Donald Knuth created TeX and LaTeX during the 1980’s. Lamport portrait by Leslie Lamport, GFDL via Wikimedia Commons w.wiki/3Daz, Knuth portrait by Jacob Appelbaum CC BY-SA via Wikimedia Commons w.wiki/3Day. Is Donald Knuth the The Yoda of Silicon Valley? (Roberts 2018)" title="" id="36" name="Picture"/>
             <a:graphic>
               <a:graphicData uri="http://schemas.openxmlformats.org/drawingml/2006/picture">
                 <pic:pic>
                   <pic:nvPicPr>
-                    <pic:cNvPr descr="images/KnuthAtOpenContentAlliance.jpg" id="48" name="Picture"/>
+                    <pic:cNvPr descr="images/KnuthAtOpenContentAlliance.jpg" id="37" name="Picture"/>
                     <pic:cNvPicPr>
                       <a:picLocks noChangeArrowheads="1" noChangeAspect="1"/>
                     </pic:cNvPicPr>
                   </pic:nvPicPr>
                   <pic:blipFill>
-                    <a:blip r:embed="rId46"/>
+                    <a:blip r:embed="rId35"/>
                     <a:stretch>
                       <a:fillRect/>
                     </a:stretch>
@@ -654,7 +654,7 @@
         <w:t xml:space="preserve">LaTeX is typically used for technical documents but it can be used for almost any form of publishing, including writing CVs, letters, books, posters, presentations and much more. Whatever you create with LaTeX, one of its key strengths is making documents look professional in portable document format (pdf) using industrial-strength typesetting.</w:t>
       </w:r>
     </w:p>
-    <w:bookmarkStart w:id="51" w:name="notword"/>
+    <w:bookmarkStart w:id="40" w:name="notword"/>
     <w:p>
       <w:pPr>
         <w:pStyle w:val="Heading2"/>
@@ -738,7 +738,7 @@
       <w:r>
         <w:t xml:space="preserve"> </w:t>
       </w:r>
-      <w:hyperlink r:id="rId49">
+      <w:hyperlink r:id="rId38">
         <w:r>
           <w:rPr>
             <w:rStyle w:val="Hyperlink"/>
@@ -791,7 +791,7 @@
       <w:r>
         <w:t xml:space="preserve">a what you see is what you get (</w:t>
       </w:r>
-      <w:hyperlink r:id="rId50">
+      <w:hyperlink r:id="rId39">
         <w:r>
           <w:rPr>
             <w:rStyle w:val="Hyperlink"/>
@@ -833,8 +833,8 @@
         <w:t xml:space="preserve">file output). LaTeX doesn’t even come with a spell-checker, though there are many plug-ins you can use for that, they are not built in.</w:t>
       </w:r>
     </w:p>
-    <w:bookmarkEnd w:id="51"/>
-    <w:bookmarkStart w:id="53" w:name="so-what-is-latex-then"/>
+    <w:bookmarkEnd w:id="40"/>
+    <w:bookmarkStart w:id="42" w:name="so-what-is-latex-then"/>
     <w:p>
       <w:pPr>
         <w:pStyle w:val="Heading2"/>
@@ -862,7 +862,7 @@
       <w:r>
         <w:t xml:space="preserve"> </w:t>
       </w:r>
-      <w:hyperlink r:id="rId52">
+      <w:hyperlink r:id="rId41">
         <w:r>
           <w:rPr>
             <w:rStyle w:val="Hyperlink"/>
@@ -885,9 +885,9 @@
         <w:t xml:space="preserve">The best way to understand LaTeX is to create some simple documents which we’ll do in the next chapter.</w:t>
       </w:r>
     </w:p>
-    <w:bookmarkEnd w:id="53"/>
-    <w:bookmarkEnd w:id="54"/>
-    <w:bookmarkStart w:id="74" w:name="simples"/>
+    <w:bookmarkEnd w:id="42"/>
+    <w:bookmarkEnd w:id="43"/>
+    <w:bookmarkStart w:id="61" w:name="simples"/>
     <w:p>
       <w:pPr>
         <w:pStyle w:val="Heading1"/>
@@ -913,7 +913,7 @@
         <w:t xml:space="preserve">Let’s start by creating a simple LaTeX document.</w:t>
       </w:r>
     </w:p>
-    <w:bookmarkStart w:id="64" w:name="shortest"/>
+    <w:bookmarkStart w:id="51" w:name="shortest"/>
     <w:p>
       <w:pPr>
         <w:pStyle w:val="Heading2"/>
@@ -942,7 +942,7 @@
         <w:rPr>
           <w:rStyle w:val="FootnoteReference"/>
         </w:rPr>
-        <w:footnoteReference w:id="55"/>
+        <w:footnoteReference w:id="44"/>
       </w:r>
       <w:r>
         <w:t xml:space="preserve">, enter the following text, then save it as a file called</w:t>
@@ -1075,7 +1075,7 @@
         <w:rPr>
           <w:rStyle w:val="FootnoteReference"/>
         </w:rPr>
-        <w:footnoteReference w:id="59"/>
+        <w:footnoteReference w:id="48"/>
       </w:r>
       <w:r>
         <w:t xml:space="preserve"> </w:t>
@@ -1096,24 +1096,12 @@
         <w:t xml:space="preserve"> </w:t>
       </w:r>
       <w:r>
-        <w:t xml:space="preserve">compiler is already installed and can be used from the command line.</w:t>
-      </w:r>
-      <w:r>
-        <w:rPr>
-          <w:rStyle w:val="FootnoteReference"/>
-        </w:rPr>
-        <w:footnoteReference w:id="61"/>
-      </w:r>
-      <w:r>
-        <w:t xml:space="preserve"> </w:t>
-      </w:r>
-      <w:r>
-        <w:t xml:space="preserve">If you’re not using Linux, you’ll need to explore the options at</w:t>
-      </w:r>
-      <w:r>
-        <w:t xml:space="preserve"> </w:t>
-      </w:r>
-      <w:hyperlink r:id="rId63">
+        <w:t xml:space="preserve">compiler is already installed and can be used from the command line. If you’re not using Linux, you’ll need to explore the options at</w:t>
+      </w:r>
+      <w:r>
+        <w:t xml:space="preserve"> </w:t>
+      </w:r>
+      <w:hyperlink r:id="rId50">
         <w:r>
           <w:rPr>
             <w:rStyle w:val="Hyperlink"/>
@@ -1299,8 +1287,8 @@
         <w:t xml:space="preserve">turing.log</w:t>
       </w:r>
     </w:p>
-    <w:bookmarkEnd w:id="64"/>
-    <w:bookmarkStart w:id="66" w:name="longer"/>
+    <w:bookmarkEnd w:id="51"/>
+    <w:bookmarkStart w:id="53" w:name="longer"/>
     <w:p>
       <w:pPr>
         <w:pStyle w:val="Heading2"/>
@@ -1809,7 +1797,7 @@
       <w:r>
         <w:t xml:space="preserve"> </w:t>
       </w:r>
-      <w:hyperlink r:id="rId65">
+      <w:hyperlink r:id="rId52">
         <w:r>
           <w:rPr>
             <w:rStyle w:val="Hyperlink"/>
@@ -1821,16 +1809,7 @@
         <w:t xml:space="preserve"> </w:t>
       </w:r>
       <w:r>
-        <w:t xml:space="preserve">calls the omnibus an</w:t>
-      </w:r>
-      <w:r>
-        <w:t xml:space="preserve"> </w:t>
-      </w:r>
-      <w:r>
-        <w:t xml:space="preserve">“incredibly fun little book”</w:t>
-      </w:r>
-      <w:r>
-        <w:t xml:space="preserve">.</w:t>
+        <w:t xml:space="preserve">calls the omnibus an “incredibly fun little book”.</w:t>
       </w:r>
       <w:r>
         <w:t xml:space="preserve"> </w:t>
@@ -1850,8 +1829,8 @@
         <w:t xml:space="preserve">)</w:t>
       </w:r>
     </w:p>
-    <w:bookmarkEnd w:id="66"/>
-    <w:bookmarkStart w:id="69" w:name="ex1"/>
+    <w:bookmarkEnd w:id="53"/>
+    <w:bookmarkStart w:id="56" w:name="ex1"/>
     <w:p>
       <w:pPr>
         <w:pStyle w:val="Heading2"/>
@@ -1894,7 +1873,7 @@
       <w:r>
         <w:t xml:space="preserve"> </w:t>
       </w:r>
-      <w:hyperlink r:id="rId67">
+      <w:hyperlink r:id="rId54">
         <w:r>
           <w:rPr>
             <w:rStyle w:val="Hyperlink"/>
@@ -1911,7 +1890,7 @@
       <w:r>
         <w:t xml:space="preserve"> </w:t>
       </w:r>
-      <w:hyperlink r:id="rId68">
+      <w:hyperlink r:id="rId55">
         <w:r>
           <w:rPr>
             <w:rStyle w:val="Hyperlink"/>
@@ -2142,8 +2121,8 @@
         <w:t xml:space="preserve">pdflatex turing.tex</w:t>
       </w:r>
     </w:p>
-    <w:bookmarkEnd w:id="69"/>
-    <w:bookmarkStart w:id="70" w:name="bold-italic-and-lists"/>
+    <w:bookmarkEnd w:id="56"/>
+    <w:bookmarkStart w:id="57" w:name="bold-italic-and-lists"/>
     <w:p>
       <w:pPr>
         <w:pStyle w:val="Heading2"/>
@@ -2291,8 +2270,8 @@
         <w:t xml:space="preserve">for bulleted lists.</w:t>
       </w:r>
     </w:p>
-    <w:bookmarkEnd w:id="70"/>
-    <w:bookmarkStart w:id="72" w:name="quotation-marks"/>
+    <w:bookmarkEnd w:id="57"/>
+    <w:bookmarkStart w:id="59" w:name="quotation-marks"/>
     <w:p>
       <w:pPr>
         <w:pStyle w:val="Heading2"/>
@@ -2315,19 +2294,7 @@
         <w:pStyle w:val="FirstParagraph"/>
       </w:pPr>
       <w:r>
-        <w:t xml:space="preserve">Typographic or</w:t>
-      </w:r>
-      <w:r>
-        <w:t xml:space="preserve"> </w:t>
-      </w:r>
-      <w:r>
-        <w:t xml:space="preserve">“curly”</w:t>
-      </w:r>
-      <w:r>
-        <w:t xml:space="preserve"> </w:t>
-      </w:r>
-      <w:r>
-        <w:t xml:space="preserve">quotation marks are different characters and</w:t>
+        <w:t xml:space="preserve">Typographic or “curly” quotation marks are different characters and</w:t>
       </w:r>
       <w:r>
         <w:t xml:space="preserve"> </w:t>
@@ -2449,16 +2416,7 @@
         </w:numPr>
       </w:pPr>
       <w:r>
-        <w:t xml:space="preserve">Turing addressed the question</w:t>
-      </w:r>
-      <w:r>
-        <w:t xml:space="preserve"> </w:t>
-      </w:r>
-      <w:r>
-        <w:t xml:space="preserve">“Can machines think”</w:t>
-      </w:r>
-      <w:r>
-        <w:t xml:space="preserve">… ✅</w:t>
+        <w:t xml:space="preserve">Turing addressed the question “Can machines think”… ✅</w:t>
       </w:r>
     </w:p>
     <w:p>
@@ -2544,7 +2502,7 @@
         <w:rPr>
           <w:rStyle w:val="FootnoteReference"/>
         </w:rPr>
-        <w:footnoteReference w:id="71"/>
+        <w:footnoteReference w:id="58"/>
       </w:r>
       <w:r>
         <w:t xml:space="preserve"> </w:t>
@@ -2565,8 +2523,8 @@
         <w:t xml:space="preserve"> </w:t>
       </w:r>
     </w:p>
-    <w:bookmarkEnd w:id="72"/>
-    <w:bookmarkStart w:id="73" w:name="concsimple"/>
+    <w:bookmarkEnd w:id="59"/>
+    <w:bookmarkStart w:id="60" w:name="concsimple"/>
     <w:p>
       <w:pPr>
         <w:pStyle w:val="Heading2"/>
@@ -2636,9 +2594,9 @@
         <w:t xml:space="preserve">Next we’ll look at adding some cross-references, figures and citations. This is one thing that LaTeX does much better than your average word processing software which makes it great for editing larger and longer documents, such as your Bachelors, Masters or PhD thesis.</w:t>
       </w:r>
     </w:p>
-    <w:bookmarkEnd w:id="73"/>
-    <w:bookmarkEnd w:id="74"/>
-    <w:bookmarkStart w:id="99" w:name="figref"/>
+    <w:bookmarkEnd w:id="60"/>
+    <w:bookmarkEnd w:id="61"/>
+    <w:bookmarkStart w:id="86" w:name="figref"/>
     <w:p>
       <w:pPr>
         <w:pStyle w:val="Heading1"/>
@@ -2697,18 +2655,18 @@
           <wp:inline>
             <wp:extent cx="572215" cy="310140"/>
             <wp:effectExtent b="0" l="0" r="0" t="0"/>
-            <wp:docPr descr="Figure 3.1: It has always been important to cite your sources and LaTeX gives you the tools to cite properly. Wikipedian Protester cartoon by Randall Munroe at xkcd.com/285 published under a Creative Commons Attribution-NonCommercial 2.5 License" title="" id="76" name="Picture"/>
+            <wp:docPr descr="Figure 3.1: It has always been important to cite your sources and LaTeX gives you the tools to cite properly. Wikipedian Protester cartoon by Randall Munroe at xkcd.com/285 published under a Creative Commons Attribution-NonCommercial 2.5 License" title="" id="63" name="Picture"/>
             <a:graphic>
               <a:graphicData uri="http://schemas.openxmlformats.org/drawingml/2006/picture">
                 <pic:pic>
                   <pic:nvPicPr>
-                    <pic:cNvPr descr="images/wikipedian_protester.png" id="77" name="Picture"/>
+                    <pic:cNvPr descr="images/wikipedian_protester.png" id="64" name="Picture"/>
                     <pic:cNvPicPr>
                       <a:picLocks noChangeArrowheads="1" noChangeAspect="1"/>
                     </pic:cNvPicPr>
                   </pic:nvPicPr>
                   <pic:blipFill>
-                    <a:blip r:embed="rId75"/>
+                    <a:blip r:embed="rId62"/>
                     <a:stretch>
                       <a:fillRect/>
                     </a:stretch>
@@ -2739,8 +2697,8 @@
       <w:pPr>
         <w:pStyle w:val="ImageCaption"/>
       </w:pPr>
-      <w:bookmarkStart w:id="78" w:name="fig:wikipedian-fig"/>
-      <w:bookmarkEnd w:id="78"/>
+      <w:bookmarkStart w:id="65" w:name="fig:wikipedian-fig"/>
+      <w:bookmarkEnd w:id="65"/>
       <w:r>
         <w:t xml:space="preserve">Figure 3.1: It has always been important to cite your sources and LaTeX gives you the tools to cite properly.</w:t>
       </w:r>
@@ -2763,7 +2721,7 @@
       <w:r>
         <w:t xml:space="preserve"> </w:t>
       </w:r>
-      <w:hyperlink r:id="rId79">
+      <w:hyperlink r:id="rId66">
         <w:r>
           <w:rPr>
             <w:rStyle w:val="Hyperlink"/>
@@ -2780,7 +2738,7 @@
       <w:r>
         <w:t xml:space="preserve"> </w:t>
       </w:r>
-      <w:hyperlink r:id="rId80">
+      <w:hyperlink r:id="rId67">
         <w:r>
           <w:rPr>
             <w:rStyle w:val="Hyperlink"/>
@@ -2797,7 +2755,7 @@
       <w:r>
         <w:t xml:space="preserve"> </w:t>
       </w:r>
-      <w:hyperlink r:id="rId81">
+      <w:hyperlink r:id="rId68">
         <w:r>
           <w:rPr>
             <w:rStyle w:val="Hyperlink"/>
@@ -2806,7 +2764,7 @@
         </w:r>
       </w:hyperlink>
     </w:p>
-    <w:bookmarkStart w:id="82" w:name="cross-referencing"/>
+    <w:bookmarkStart w:id="69" w:name="cross-referencing"/>
     <w:p>
       <w:pPr>
         <w:pStyle w:val="Heading2"/>
@@ -3118,8 +3076,8 @@
         <w:t xml:space="preserve">}</w:t>
       </w:r>
     </w:p>
-    <w:bookmarkEnd w:id="82"/>
-    <w:bookmarkStart w:id="89" w:name="illustrating-your-documents"/>
+    <w:bookmarkEnd w:id="69"/>
+    <w:bookmarkStart w:id="76" w:name="illustrating-your-documents"/>
     <w:p>
       <w:pPr>
         <w:pStyle w:val="Heading2"/>
@@ -3163,18 +3121,18 @@
           <wp:inline>
             <wp:extent cx="2133600" cy="2904856"/>
             <wp:effectExtent b="0" l="0" r="0" t="0"/>
-            <wp:docPr descr="Figure 3.2: Alan Turing at the age of sixteen, portrait by unknown author, public domain, via Wikimedia Commons w.wiki/oZx" title="" id="84" name="Picture"/>
+            <wp:docPr descr="Figure 3.2: Alan Turing at the age of sixteen, portrait by unknown author, public domain, via Wikimedia Commons w.wiki/oZx" title="" id="71" name="Picture"/>
             <a:graphic>
               <a:graphicData uri="http://schemas.openxmlformats.org/drawingml/2006/picture">
                 <pic:pic>
                   <pic:nvPicPr>
-                    <pic:cNvPr descr="images/Alan_Turing_Aged_16.jpg" id="85" name="Picture"/>
+                    <pic:cNvPr descr="images/Alan_Turing_Aged_16.jpg" id="72" name="Picture"/>
                     <pic:cNvPicPr>
                       <a:picLocks noChangeArrowheads="1" noChangeAspect="1"/>
                     </pic:cNvPicPr>
                   </pic:nvPicPr>
                   <pic:blipFill>
-                    <a:blip r:embed="rId83"/>
+                    <a:blip r:embed="rId70"/>
                     <a:stretch>
                       <a:fillRect/>
                     </a:stretch>
@@ -3205,15 +3163,15 @@
       <w:pPr>
         <w:pStyle w:val="ImageCaption"/>
       </w:pPr>
-      <w:bookmarkStart w:id="86" w:name="fig:turing-fig"/>
-      <w:bookmarkEnd w:id="86"/>
+      <w:bookmarkStart w:id="73" w:name="fig:turing-fig"/>
+      <w:bookmarkEnd w:id="73"/>
       <w:r>
         <w:t xml:space="preserve">Figure 3.2:</w:t>
       </w:r>
       <w:r>
         <w:t xml:space="preserve"> </w:t>
       </w:r>
-      <w:hyperlink r:id="rId87">
+      <w:hyperlink r:id="rId74">
         <w:r>
           <w:rPr>
             <w:rStyle w:val="Hyperlink"/>
@@ -3230,7 +3188,7 @@
       <w:r>
         <w:t xml:space="preserve"> </w:t>
       </w:r>
-      <w:hyperlink r:id="rId88">
+      <w:hyperlink r:id="rId75">
         <w:r>
           <w:rPr>
             <w:rStyle w:val="Hyperlink"/>
@@ -3422,19 +3380,7 @@
         <w:t xml:space="preserve"> </w:t>
       </w:r>
       <w:r>
-        <w:t xml:space="preserve">code wraps up whatever picture you’re including, and allows LaTeX to treat it as an unbreakable floating thing that it will position for you as best it can in the document, while maintaining an overall nice typographical layout. This</w:t>
-      </w:r>
-      <w:r>
-        <w:t xml:space="preserve"> </w:t>
-      </w:r>
-      <w:r>
-        <w:t xml:space="preserve">“floating”</w:t>
-      </w:r>
-      <w:r>
-        <w:t xml:space="preserve"> </w:t>
-      </w:r>
-      <w:r>
-        <w:t xml:space="preserve">of figures can sometimes result in the figure ending up in a place you didn’t expect, but in most cases LaTeX will make the most sensible choice. It’s possible to employ finer control over figure placement, but that’s beyond the scope of this guide.</w:t>
+        <w:t xml:space="preserve">code wraps up whatever picture you’re including, and allows LaTeX to treat it as an unbreakable floating thing that it will position for you as best it can in the document, while maintaining an overall nice typographical layout. This “floating” of figures can sometimes result in the figure ending up in a place you didn’t expect, but in most cases LaTeX will make the most sensible choice. It’s possible to employ finer control over figure placement, but that’s beyond the scope of this guide.</w:t>
       </w:r>
     </w:p>
     <w:p>
@@ -3585,8 +3531,8 @@
         <w:t xml:space="preserve">}</w:t>
       </w:r>
     </w:p>
-    <w:bookmarkEnd w:id="89"/>
-    <w:bookmarkStart w:id="90" w:name="ex2"/>
+    <w:bookmarkEnd w:id="76"/>
+    <w:bookmarkStart w:id="77" w:name="ex2"/>
     <w:p>
       <w:pPr>
         <w:pStyle w:val="Heading2"/>
@@ -3624,8 +3570,8 @@
         <w:t xml:space="preserve">, that contains some text (maybe from Lorem Ipsum), together with a figure containing an image of your choice. Create a cross reference to the figure in the text.</w:t>
       </w:r>
     </w:p>
-    <w:bookmarkEnd w:id="90"/>
-    <w:bookmarkStart w:id="97" w:name="citations-and-footnotes"/>
+    <w:bookmarkEnd w:id="77"/>
+    <w:bookmarkStart w:id="84" w:name="citations-and-footnotes"/>
     <w:p>
       <w:pPr>
         <w:pStyle w:val="Heading2"/>
@@ -3654,7 +3600,7 @@
         <w:rPr>
           <w:rStyle w:val="FootnoteReference"/>
         </w:rPr>
-        <w:footnoteReference w:id="91"/>
+        <w:footnoteReference w:id="78"/>
       </w:r>
       <w:r>
         <w:t xml:space="preserve"> </w:t>
@@ -3885,7 +3831,7 @@
         <w:rPr>
           <w:rStyle w:val="FootnoteReference"/>
         </w:rPr>
-        <w:footnoteReference w:id="92"/>
+        <w:footnoteReference w:id="79"/>
       </w:r>
       <w:r>
         <w:t xml:space="preserve"> </w:t>
@@ -4030,7 +3976,7 @@
         <w:rPr>
           <w:rStyle w:val="FootnoteReference"/>
         </w:rPr>
-        <w:footnoteReference w:id="95"/>
+        <w:footnoteReference w:id="82"/>
       </w:r>
       <w:r>
         <w:t xml:space="preserve"> </w:t>
@@ -4583,8 +4529,8 @@
         <w:t xml:space="preserve">If you find all the typing at the command line tedious, you could write a little bash script to automate this simple workflow including opening the pdf when it is created.</w:t>
       </w:r>
     </w:p>
-    <w:bookmarkEnd w:id="97"/>
-    <w:bookmarkStart w:id="98" w:name="fingconc"/>
+    <w:bookmarkEnd w:id="84"/>
+    <w:bookmarkStart w:id="85" w:name="fingconc"/>
     <w:p>
       <w:pPr>
         <w:pStyle w:val="Heading2"/>
@@ -4610,9 +4556,9 @@
         <w:t xml:space="preserve">You have cross-referenced, illustrated, added citations and footnotes to your document. Next we’ll look at doing some maths.</w:t>
       </w:r>
     </w:p>
-    <w:bookmarkEnd w:id="98"/>
-    <w:bookmarkEnd w:id="99"/>
-    <w:bookmarkStart w:id="107" w:name="maths"/>
+    <w:bookmarkEnd w:id="85"/>
+    <w:bookmarkEnd w:id="86"/>
+    <w:bookmarkStart w:id="94" w:name="maths"/>
     <w:p>
       <w:pPr>
         <w:pStyle w:val="Heading1"/>
@@ -4648,7 +4594,7 @@
       <w:r>
         <w:t xml:space="preserve"> </w:t>
       </w:r>
-      <w:hyperlink r:id="rId100">
+      <w:hyperlink r:id="rId87">
         <w:r>
           <w:rPr>
             <w:rStyle w:val="Hyperlink"/>
@@ -4665,7 +4611,7 @@
       <w:r>
         <w:t xml:space="preserve"> </w:t>
       </w:r>
-      <w:hyperlink r:id="rId101">
+      <w:hyperlink r:id="rId88">
         <w:r>
           <w:rPr>
             <w:rStyle w:val="Hyperlink"/>
@@ -4677,7 +4623,7 @@
         <w:t xml:space="preserve">. Otherwise, if you can see the equation below, it is safe to read on…</w:t>
       </w:r>
     </w:p>
-    <w:bookmarkStart w:id="102" w:name="equations"/>
+    <w:bookmarkStart w:id="89" w:name="equations"/>
     <w:p>
       <w:pPr>
         <w:pStyle w:val="Heading2"/>
@@ -5111,16 +5057,10 @@
                   </m:sSub>
                 </m:num>
                 <m:den>
-                  <m:r>
-                    <m:t>d</m:t>
-                  </m:r>
-                  <m:sSub>
+                  <m:sSubSup>
                     <m:e>
                       <m:r>
-                        <m:rPr>
-                          <m:sty m:val="p"/>
-                        </m:rPr>
-                        <m:t>′</m:t>
+                        <m:t>d</m:t>
                       </m:r>
                     </m:e>
                     <m:sub>
@@ -5128,150 +5068,164 @@
                         <m:t>i</m:t>
                       </m:r>
                     </m:sub>
-                  </m:sSub>
+                    <m:sup>
+                      <m:r>
+                        <m:rPr>
+                          <m:sty m:val="p"/>
+                        </m:rPr>
+                        <m:t>′</m:t>
+                      </m:r>
+                    </m:sup>
+                  </m:sSubSup>
                 </m:den>
               </m:f>
             </m:e>
           </m:nary>
-          <m:d>
-            <m:dPr>
-              <m:begChr m:val="["/>
-              <m:sepChr m:val=""/>
-              <m:endChr m:val="]"/>
-              <m:grow/>
-            </m:dPr>
+          <m:r>
+            <m:rPr>
+              <m:sty m:val="p"/>
+            </m:rPr>
+            <m:t>[</m:t>
+          </m:r>
+          <m:sSub>
+            <m:e>
+              <m:r>
+                <m:t>k</m:t>
+              </m:r>
+            </m:e>
+            <m:sub>
+              <m:r>
+                <m:t>d</m:t>
+              </m:r>
+            </m:sub>
+          </m:sSub>
+          <m:r>
+            <m:rPr>
+              <m:sty m:val="p"/>
+            </m:rPr>
+            <m:t>(</m:t>
+          </m:r>
+          <m:acc>
+            <m:accPr>
+              <m:chr m:val="̂"/>
+            </m:accPr>
+            <m:e>
+              <m:r>
+                <m:t>N</m:t>
+              </m:r>
+            </m:e>
+          </m:acc>
+          <m:r>
+            <m:rPr>
+              <m:sty m:val="p"/>
+            </m:rPr>
+            <m:t>⋅</m:t>
+          </m:r>
+          <m:acc>
+            <m:accPr>
+              <m:chr m:val="̂"/>
+            </m:accPr>
             <m:e>
               <m:sSub>
                 <m:e>
                   <m:r>
-                    <m:t>k</m:t>
+                    <m:t>L</m:t>
                   </m:r>
                 </m:e>
                 <m:sub>
                   <m:r>
-                    <m:t>d</m:t>
+                    <m:t>i</m:t>
                   </m:r>
                 </m:sub>
               </m:sSub>
-              <m:d>
-                <m:dPr>
-                  <m:begChr m:val="("/>
-                  <m:sepChr m:val=""/>
-                  <m:endChr m:val=")"/>
-                  <m:grow/>
-                </m:dPr>
+            </m:e>
+          </m:acc>
+          <m:r>
+            <m:rPr>
+              <m:sty m:val="p"/>
+            </m:rPr>
+            <m:t>)</m:t>
+          </m:r>
+          <m:r>
+            <m:rPr>
+              <m:sty m:val="p"/>
+            </m:rPr>
+            <m:t>+</m:t>
+          </m:r>
+          <m:sSub>
+            <m:e>
+              <m:r>
+                <m:t>k</m:t>
+              </m:r>
+            </m:e>
+            <m:sub>
+              <m:r>
+                <m:t>s</m:t>
+              </m:r>
+            </m:sub>
+          </m:sSub>
+          <m:r>
+            <m:rPr>
+              <m:sty m:val="p"/>
+            </m:rPr>
+            <m:t>(</m:t>
+          </m:r>
+          <m:acc>
+            <m:accPr>
+              <m:chr m:val="̂"/>
+            </m:accPr>
+            <m:e>
+              <m:sSub>
                 <m:e>
-                  <m:acc>
-                    <m:accPr>
-                      <m:chr m:val="̂"/>
-                    </m:accPr>
-                    <m:e>
-                      <m:r>
-                        <m:t>N</m:t>
-                      </m:r>
-                    </m:e>
-                  </m:acc>
                   <m:r>
-                    <m:rPr>
-                      <m:sty m:val="p"/>
-                    </m:rPr>
-                    <m:t>⋅</m:t>
+                    <m:t>R</m:t>
                   </m:r>
-                  <m:acc>
-                    <m:accPr>
-                      <m:chr m:val="̂"/>
-                    </m:accPr>
-                    <m:e>
-                      <m:sSub>
-                        <m:e>
-                          <m:r>
-                            <m:t>L</m:t>
-                          </m:r>
-                        </m:e>
-                        <m:sub>
-                          <m:r>
-                            <m:t>i</m:t>
-                          </m:r>
-                        </m:sub>
-                      </m:sSub>
-                    </m:e>
-                  </m:acc>
                 </m:e>
-              </m:d>
+                <m:sub>
+                  <m:r>
+                    <m:t>i</m:t>
+                  </m:r>
+                </m:sub>
+              </m:sSub>
+            </m:e>
+          </m:acc>
+          <m:r>
+            <m:rPr>
+              <m:sty m:val="p"/>
+            </m:rPr>
+            <m:t>⋅</m:t>
+          </m:r>
+          <m:acc>
+            <m:accPr>
+              <m:chr m:val="̂"/>
+            </m:accPr>
+            <m:e>
+              <m:r>
+                <m:t>V</m:t>
+              </m:r>
+            </m:e>
+          </m:acc>
+          <m:sSup>
+            <m:e>
               <m:r>
                 <m:rPr>
                   <m:sty m:val="p"/>
                 </m:rPr>
-                <m:t>+</m:t>
+                <m:t>)</m:t>
               </m:r>
-              <m:sSub>
-                <m:e>
-                  <m:r>
-                    <m:t>k</m:t>
-                  </m:r>
-                </m:e>
-                <m:sub>
-                  <m:r>
-                    <m:t>s</m:t>
-                  </m:r>
-                </m:sub>
-              </m:sSub>
-              <m:sSup>
-                <m:e>
-                  <m:d>
-                    <m:dPr>
-                      <m:begChr m:val="("/>
-                      <m:sepChr m:val=""/>
-                      <m:endChr m:val=")"/>
-                      <m:grow/>
-                    </m:dPr>
-                    <m:e>
-                      <m:acc>
-                        <m:accPr>
-                          <m:chr m:val="̂"/>
-                        </m:accPr>
-                        <m:e>
-                          <m:sSub>
-                            <m:e>
-                              <m:r>
-                                <m:t>R</m:t>
-                              </m:r>
-                            </m:e>
-                            <m:sub>
-                              <m:r>
-                                <m:t>i</m:t>
-                              </m:r>
-                            </m:sub>
-                          </m:sSub>
-                        </m:e>
-                      </m:acc>
-                      <m:r>
-                        <m:rPr>
-                          <m:sty m:val="p"/>
-                        </m:rPr>
-                        <m:t>⋅</m:t>
-                      </m:r>
-                      <m:acc>
-                        <m:accPr>
-                          <m:chr m:val="̂"/>
-                        </m:accPr>
-                        <m:e>
-                          <m:r>
-                            <m:t>V</m:t>
-                          </m:r>
-                        </m:e>
-                      </m:acc>
-                    </m:e>
-                  </m:d>
-                </m:e>
-                <m:sup>
-                  <m:r>
-                    <m:t>n</m:t>
-                  </m:r>
-                </m:sup>
-              </m:sSup>
             </m:e>
-          </m:d>
+            <m:sup>
+              <m:r>
+                <m:t>n</m:t>
+              </m:r>
+            </m:sup>
+          </m:sSup>
+          <m:r>
+            <m:rPr>
+              <m:sty m:val="p"/>
+            </m:rPr>
+            <m:t>]</m:t>
+          </m:r>
         </m:oMath>
       </m:oMathPara>
     </w:p>
@@ -5656,8 +5610,8 @@
         <w:t xml:space="preserve">, which is not at all what we want (even LaTeX can’t always know what we really want).</w:t>
       </w:r>
     </w:p>
-    <w:bookmarkEnd w:id="102"/>
-    <w:bookmarkStart w:id="104" w:name="matrix"/>
+    <w:bookmarkEnd w:id="89"/>
+    <w:bookmarkStart w:id="91" w:name="matrix"/>
     <w:p>
       <w:pPr>
         <w:pStyle w:val="Heading2"/>
@@ -6245,16 +6199,7 @@
         <w:t xml:space="preserve"> </w:t>
       </w:r>
       <w:r>
-        <w:t xml:space="preserve">means</w:t>
-      </w:r>
-      <w:r>
-        <w:t xml:space="preserve"> </w:t>
-      </w:r>
-      <w:r>
-        <w:t xml:space="preserve">‘big opening square bracket please’</w:t>
-      </w:r>
-      <w:r>
-        <w:t xml:space="preserve">;</w:t>
+        <w:t xml:space="preserve">means ‘big opening square bracket please’;</w:t>
       </w:r>
       <w:r>
         <w:t xml:space="preserve"> </w:t>
@@ -6269,16 +6214,7 @@
         <w:t xml:space="preserve"> </w:t>
       </w:r>
       <w:r>
-        <w:t xml:space="preserve">means</w:t>
-      </w:r>
-      <w:r>
-        <w:t xml:space="preserve"> </w:t>
-      </w:r>
-      <w:r>
-        <w:t xml:space="preserve">‘an array with 4 columns please, with the items in each column centred’</w:t>
-      </w:r>
-      <w:r>
-        <w:t xml:space="preserve">;</w:t>
+        <w:t xml:space="preserve">means ‘an array with 4 columns please, with the items in each column centred’;</w:t>
       </w:r>
       <w:r>
         <w:t xml:space="preserve"> </w:t>
@@ -6293,16 +6229,7 @@
         <w:t xml:space="preserve"> </w:t>
       </w:r>
       <w:r>
-        <w:t xml:space="preserve">means</w:t>
-      </w:r>
-      <w:r>
-        <w:t xml:space="preserve"> </w:t>
-      </w:r>
-      <w:r>
-        <w:t xml:space="preserve">‘start a new column’</w:t>
-      </w:r>
-      <w:r>
-        <w:t xml:space="preserve">; and</w:t>
+        <w:t xml:space="preserve">means ‘start a new column’; and</w:t>
       </w:r>
       <w:r>
         <w:t xml:space="preserve"> </w:t>
@@ -6317,16 +6244,7 @@
         <w:t xml:space="preserve"> </w:t>
       </w:r>
       <w:r>
-        <w:t xml:space="preserve">means</w:t>
-      </w:r>
-      <w:r>
-        <w:t xml:space="preserve"> </w:t>
-      </w:r>
-      <w:r>
-        <w:t xml:space="preserve">‘start a new row’</w:t>
-      </w:r>
-      <w:r>
-        <w:t xml:space="preserve">. You’ll notice that LaTeX knows about greek letters; it knows about most standard maths symbols too, and also the ways they’re usually used.</w:t>
+        <w:t xml:space="preserve">means ‘start a new row’. You’ll notice that LaTeX knows about greek letters; it knows about most standard maths symbols too, and also the ways they’re usually used.</w:t>
       </w:r>
     </w:p>
     <w:p>
@@ -6389,7 +6307,7 @@
       <w:r>
         <w:t xml:space="preserve"> </w:t>
       </w:r>
-      <w:hyperlink r:id="rId103">
+      <w:hyperlink r:id="rId90">
         <w:r>
           <w:rPr>
             <w:rStyle w:val="Hyperlink"/>
@@ -6437,8 +6355,8 @@
         <w:t xml:space="preserve">)</w:t>
       </w:r>
     </w:p>
-    <w:bookmarkEnd w:id="104"/>
-    <w:bookmarkStart w:id="105" w:name="ex3"/>
+    <w:bookmarkEnd w:id="91"/>
+    <w:bookmarkStart w:id="92" w:name="ex3"/>
     <w:p>
       <w:pPr>
         <w:pStyle w:val="Heading2"/>
@@ -6625,37 +6543,39 @@
         <w:t xml:space="preserve"> </w:t>
       </w:r>
       <m:oMath>
-        <m:d>
-          <m:dPr>
-            <m:begChr m:val="("/>
-            <m:sepChr m:val=""/>
-            <m:endChr m:val=")"/>
-            <m:grow/>
-          </m:dPr>
-          <m:e>
-            <m:r>
-              <m:t>3</m:t>
-            </m:r>
-            <m:r>
-              <m:rPr>
-                <m:sty m:val="p"/>
-              </m:rPr>
-              <m:t>,</m:t>
-            </m:r>
-            <m:r>
-              <m:t>4</m:t>
-            </m:r>
-            <m:r>
-              <m:rPr>
-                <m:sty m:val="p"/>
-              </m:rPr>
-              <m:t>,</m:t>
-            </m:r>
-            <m:r>
-              <m:t>5</m:t>
-            </m:r>
-          </m:e>
-        </m:d>
+        <m:r>
+          <m:rPr>
+            <m:sty m:val="p"/>
+          </m:rPr>
+          <m:t>(</m:t>
+        </m:r>
+        <m:r>
+          <m:t>3</m:t>
+        </m:r>
+        <m:r>
+          <m:rPr>
+            <m:sty m:val="p"/>
+          </m:rPr>
+          <m:t>,</m:t>
+        </m:r>
+        <m:r>
+          <m:t>4</m:t>
+        </m:r>
+        <m:r>
+          <m:rPr>
+            <m:sty m:val="p"/>
+          </m:rPr>
+          <m:t>,</m:t>
+        </m:r>
+        <m:r>
+          <m:t>5</m:t>
+        </m:r>
+        <m:r>
+          <m:rPr>
+            <m:sty m:val="p"/>
+          </m:rPr>
+          <m:t>)</m:t>
+        </m:r>
       </m:oMath>
       <w:r>
         <w:t xml:space="preserve"> </w:t>
@@ -6667,37 +6587,39 @@
         <w:t xml:space="preserve"> </w:t>
       </w:r>
       <m:oMath>
-        <m:d>
-          <m:dPr>
-            <m:begChr m:val="("/>
-            <m:sepChr m:val=""/>
-            <m:endChr m:val=")"/>
-            <m:grow/>
-          </m:dPr>
-          <m:e>
-            <m:r>
-              <m:t>5</m:t>
-            </m:r>
-            <m:r>
-              <m:rPr>
-                <m:sty m:val="p"/>
-              </m:rPr>
-              <m:t>,</m:t>
-            </m:r>
-            <m:r>
-              <m:t>12</m:t>
-            </m:r>
-            <m:r>
-              <m:rPr>
-                <m:sty m:val="p"/>
-              </m:rPr>
-              <m:t>,</m:t>
-            </m:r>
-            <m:r>
-              <m:t>13</m:t>
-            </m:r>
-          </m:e>
-        </m:d>
+        <m:r>
+          <m:rPr>
+            <m:sty m:val="p"/>
+          </m:rPr>
+          <m:t>(</m:t>
+        </m:r>
+        <m:r>
+          <m:t>5</m:t>
+        </m:r>
+        <m:r>
+          <m:rPr>
+            <m:sty m:val="p"/>
+          </m:rPr>
+          <m:t>,</m:t>
+        </m:r>
+        <m:r>
+          <m:t>12</m:t>
+        </m:r>
+        <m:r>
+          <m:rPr>
+            <m:sty m:val="p"/>
+          </m:rPr>
+          <m:t>,</m:t>
+        </m:r>
+        <m:r>
+          <m:t>13</m:t>
+        </m:r>
+        <m:r>
+          <m:rPr>
+            <m:sty m:val="p"/>
+          </m:rPr>
+          <m:t>)</m:t>
+        </m:r>
       </m:oMath>
       <w:r>
         <w:t xml:space="preserve">. Such solutions are called</w:t>
@@ -6854,8 +6776,8 @@
         </m:oMath>
       </m:oMathPara>
     </w:p>
-    <w:bookmarkEnd w:id="105"/>
-    <w:bookmarkStart w:id="106" w:name="mathconc"/>
+    <w:bookmarkEnd w:id="92"/>
+    <w:bookmarkStart w:id="93" w:name="mathconc"/>
     <w:p>
       <w:pPr>
         <w:pStyle w:val="Heading2"/>
@@ -6881,9 +6803,9 @@
         <w:t xml:space="preserve">We’ve briefly introduced typesetting mathematics in LaTeX with some equations and a matrix. LaTeX can handle a lot more maths than that but this gives you a flavour of what it can do. In the next chapter we’ll look at collaborative authoring and editing in the cloud with overleaf.</w:t>
       </w:r>
     </w:p>
-    <w:bookmarkEnd w:id="106"/>
-    <w:bookmarkEnd w:id="107"/>
-    <w:bookmarkStart w:id="125" w:name="overleaf"/>
+    <w:bookmarkEnd w:id="93"/>
+    <w:bookmarkEnd w:id="94"/>
+    <w:bookmarkStart w:id="112" w:name="overleaf"/>
     <w:p>
       <w:pPr>
         <w:pStyle w:val="Heading1"/>
@@ -6935,7 +6857,7 @@
       <w:r>
         <w:t xml:space="preserve">. Overleaf (</w:t>
       </w:r>
-      <w:hyperlink r:id="rId108">
+      <w:hyperlink r:id="rId95">
         <w:r>
           <w:rPr>
             <w:rStyle w:val="Hyperlink"/>
@@ -6965,18 +6887,18 @@
           <wp:inline>
             <wp:extent cx="5334000" cy="2647139"/>
             <wp:effectExtent b="0" l="0" r="0" t="0"/>
-            <wp:docPr descr="Figure 5.1: A screenshot of overleaf showing the source TeX on the left hand side and the corresponding pdf on the right hand side. Screenshot by Dan Cherniy via Wikimedia Commons at w.wiki/omo" title="" id="110" name="Picture"/>
+            <wp:docPr descr="Figure 5.1: A screenshot of overleaf showing the source TeX on the left hand side and the corresponding pdf on the right hand side. Screenshot by Dan Cherniy via Wikimedia Commons at w.wiki/omo" title="" id="97" name="Picture"/>
             <a:graphic>
               <a:graphicData uri="http://schemas.openxmlformats.org/drawingml/2006/picture">
                 <pic:pic>
                   <pic:nvPicPr>
-                    <pic:cNvPr descr="images/Overleaf_v2_editing_page.jpg" id="111" name="Picture"/>
+                    <pic:cNvPr descr="images/Overleaf_v2_editing_page.jpg" id="98" name="Picture"/>
                     <pic:cNvPicPr>
                       <a:picLocks noChangeArrowheads="1" noChangeAspect="1"/>
                     </pic:cNvPicPr>
                   </pic:nvPicPr>
                   <pic:blipFill>
-                    <a:blip r:embed="rId109"/>
+                    <a:blip r:embed="rId96"/>
                     <a:stretch>
                       <a:fillRect/>
                     </a:stretch>
@@ -7007,15 +6929,15 @@
       <w:pPr>
         <w:pStyle w:val="ImageCaption"/>
       </w:pPr>
-      <w:bookmarkStart w:id="112" w:name="fig:overleaf-fig"/>
-      <w:bookmarkEnd w:id="112"/>
+      <w:bookmarkStart w:id="99" w:name="fig:overleaf-fig"/>
+      <w:bookmarkEnd w:id="99"/>
       <w:r>
         <w:t xml:space="preserve">Figure 5.1: A screenshot of overleaf showing the source TeX on the left hand side and the corresponding pdf on the right hand side. Screenshot by Dan Cherniy via Wikimedia Commons at</w:t>
       </w:r>
       <w:r>
         <w:t xml:space="preserve"> </w:t>
       </w:r>
-      <w:hyperlink r:id="rId113">
+      <w:hyperlink r:id="rId100">
         <w:r>
           <w:rPr>
             <w:rStyle w:val="Hyperlink"/>
@@ -7034,7 +6956,7 @@
       <w:r>
         <w:t xml:space="preserve"> </w:t>
       </w:r>
-      <w:hyperlink r:id="rId114">
+      <w:hyperlink r:id="rId101">
         <w:r>
           <w:rPr>
             <w:rStyle w:val="Hyperlink"/>
@@ -7051,7 +6973,7 @@
       <w:r>
         <w:t xml:space="preserve"> </w:t>
       </w:r>
-      <w:hyperlink r:id="rId115">
+      <w:hyperlink r:id="rId102">
         <w:r>
           <w:rPr>
             <w:rStyle w:val="Hyperlink"/>
@@ -7102,7 +7024,7 @@
         <w:rPr>
           <w:rStyle w:val="FootnoteReference"/>
         </w:rPr>
-        <w:footnoteReference w:id="116"/>
+        <w:footnoteReference w:id="103"/>
       </w:r>
     </w:p>
     <w:p>
@@ -7117,7 +7039,7 @@
         <w:t xml:space="preserve">Overleaf publish lots of tutorials to help you learn LaTeX</w:t>
       </w:r>
     </w:p>
-    <w:bookmarkStart w:id="123" w:name="ex4"/>
+    <w:bookmarkStart w:id="110" w:name="ex4"/>
     <w:p>
       <w:pPr>
         <w:pStyle w:val="Heading2"/>
@@ -7145,7 +7067,7 @@
       <w:r>
         <w:t xml:space="preserve"> </w:t>
       </w:r>
-      <w:hyperlink r:id="rId108">
+      <w:hyperlink r:id="rId95">
         <w:r>
           <w:rPr>
             <w:rStyle w:val="Hyperlink"/>
@@ -7185,7 +7107,7 @@
         <w:rPr>
           <w:rStyle w:val="FootnoteReference"/>
         </w:rPr>
-        <w:footnoteReference w:id="119"/>
+        <w:footnoteReference w:id="106"/>
       </w:r>
       <w:r>
         <w:br/>
@@ -7217,7 +7139,7 @@
       <w:r>
         <w:t xml:space="preserve"> </w:t>
       </w:r>
-      <w:hyperlink r:id="rId121">
+      <w:hyperlink r:id="rId108">
         <w:r>
           <w:rPr>
             <w:rStyle w:val="Hyperlink"/>
@@ -7234,7 +7156,7 @@
       <w:r>
         <w:t xml:space="preserve"> </w:t>
       </w:r>
-      <w:hyperlink r:id="rId122">
+      <w:hyperlink r:id="rId109">
         <w:r>
           <w:rPr>
             <w:rStyle w:val="Hyperlink"/>
@@ -7249,8 +7171,8 @@
         <w:t xml:space="preserve">if you want to take things further</w:t>
       </w:r>
     </w:p>
-    <w:bookmarkEnd w:id="123"/>
-    <w:bookmarkStart w:id="124" w:name="overleafconc"/>
+    <w:bookmarkEnd w:id="110"/>
+    <w:bookmarkStart w:id="111" w:name="overleafconc"/>
     <w:p>
       <w:pPr>
         <w:pStyle w:val="Heading2"/>
@@ -7273,7 +7195,7 @@
         <w:pStyle w:val="FirstParagraph"/>
       </w:pPr>
       <w:r>
-        <w:t xml:space="preserve">Overleaf provides a modern and convenient cloud based interface to tried and tested LaTeX tools, which have been around for over thirty years.</w:t>
+        <w:t xml:space="preserve">Overleaf provides a modern and convenient cloud based interface to tried and tested LaTeX tools, which have been around for over forty years.</w:t>
       </w:r>
       <w:r>
         <w:t xml:space="preserve"> </w:t>
@@ -7319,24 +7241,12 @@
         <w:t xml:space="preserve"> </w:t>
       </w:r>
       <w:r>
-        <w:t xml:space="preserve">Which interface is</w:t>
-      </w:r>
-      <w:r>
-        <w:t xml:space="preserve"> </w:t>
-      </w:r>
-      <w:r>
-        <w:t xml:space="preserve">“best”</w:t>
-      </w:r>
-      <w:r>
-        <w:t xml:space="preserve"> </w:t>
-      </w:r>
-      <w:r>
-        <w:t xml:space="preserve">for you will largely depend on what kind of documents you are writing and what your workflow is. In the next chapter we will create a curriculum vitae using CV templates provided by overleaf.</w:t>
-      </w:r>
-    </w:p>
-    <w:bookmarkEnd w:id="124"/>
-    <w:bookmarkEnd w:id="125"/>
-    <w:bookmarkStart w:id="151" w:name="cv"/>
+        <w:t xml:space="preserve">Which interface is “best” for you will largely depend on what kind of documents you are writing and what your workflow is. In the next chapter we will create a curriculum vitae using CV templates provided by overleaf.</w:t>
+      </w:r>
+    </w:p>
+    <w:bookmarkEnd w:id="111"/>
+    <w:bookmarkEnd w:id="112"/>
+    <w:bookmarkStart w:id="140" w:name="cv"/>
     <w:p>
       <w:pPr>
         <w:pStyle w:val="Heading1"/>
@@ -7381,7 +7291,7 @@
         <w:rPr>
           <w:rStyle w:val="FootnoteReference"/>
         </w:rPr>
-        <w:footnoteReference w:id="126"/>
+        <w:footnoteReference w:id="113"/>
       </w:r>
       <w:r>
         <w:t xml:space="preserve"> </w:t>
@@ -7408,18 +7318,18 @@
           <wp:inline>
             <wp:extent cx="5334000" cy="6339737"/>
             <wp:effectExtent b="0" l="0" r="0" t="0"/>
-            <wp:docPr descr="Figure 6.1: A fictitious example CV using an overleaf template. Would you invite Neil to interview based on his CV? This is what your CV needs to do, convince a decision maker they really need to contact you to find out more. This is just a screenshot, the pdf can be found at cdyf.me/Neil_Pointer.pdf. There are over 600 CV templates available to choose from at overleaf.com/gallery/tagged/cv" title="" id="128" name="Picture"/>
+            <wp:docPr descr="Figure 6.1: A fictitious example CV using an overleaf template. Would you invite Neil to interview based on his CV? This is what your CV needs to do, convince a decision maker they really need to contact you to find out more. This is just a screenshot, the pdf can be found at cdyf.me/Neil_Pointer.pdf. There are over 600 CV templates available to choose from at overleaf.com/gallery/tagged/cv" title="" id="115" name="Picture"/>
             <a:graphic>
               <a:graphicData uri="http://schemas.openxmlformats.org/drawingml/2006/picture">
                 <pic:pic>
                   <pic:nvPicPr>
-                    <pic:cNvPr descr="images/jake-ryan.png" id="129" name="Picture"/>
+                    <pic:cNvPr descr="images/jake-ryan.png" id="116" name="Picture"/>
                     <pic:cNvPicPr>
                       <a:picLocks noChangeArrowheads="1" noChangeAspect="1"/>
                     </pic:cNvPicPr>
                   </pic:nvPicPr>
                   <pic:blipFill>
-                    <a:blip r:embed="rId127"/>
+                    <a:blip r:embed="rId114"/>
                     <a:stretch>
                       <a:fillRect/>
                     </a:stretch>
@@ -7450,15 +7360,15 @@
       <w:pPr>
         <w:pStyle w:val="ImageCaption"/>
       </w:pPr>
-      <w:bookmarkStart w:id="130" w:name="fig:cv-fig"/>
-      <w:bookmarkEnd w:id="130"/>
+      <w:bookmarkStart w:id="117" w:name="fig:cv-fig"/>
+      <w:bookmarkEnd w:id="117"/>
       <w:r>
         <w:t xml:space="preserve">Figure 6.1: A fictitious example CV using an overleaf template. Would you invite Neil to interview based on his CV? This is what your CV needs to do, convince a decision maker they really need to contact you to find out more. This is just a screenshot, the pdf can be found at</w:t>
       </w:r>
       <w:r>
         <w:t xml:space="preserve"> </w:t>
       </w:r>
-      <w:hyperlink r:id="rId131">
+      <w:hyperlink r:id="rId118">
         <w:r>
           <w:rPr>
             <w:rStyle w:val="Hyperlink"/>
@@ -7472,7 +7382,7 @@
       <w:r>
         <w:t xml:space="preserve"> </w:t>
       </w:r>
-      <w:hyperlink r:id="rId132">
+      <w:hyperlink r:id="rId119">
         <w:r>
           <w:rPr>
             <w:rStyle w:val="Hyperlink"/>
@@ -7553,7 +7463,7 @@
         <w:t xml:space="preserve">the editing, what you’ve decided to leave in (and leave out) of your CV</w:t>
       </w:r>
     </w:p>
-    <w:bookmarkStart w:id="140" w:name="knocking"/>
+    <w:bookmarkStart w:id="129" w:name="knocking"/>
     <w:p>
       <w:pPr>
         <w:pStyle w:val="Heading2"/>
@@ -7595,7 +7505,7 @@
         <w:t xml:space="preserve">we mean both immediate ones within the next 12 months as well as those further in the future. To make the most of those opportunities, your CV needs to be persuasive enough to make an employer think they should invite you to interview.</w:t>
       </w:r>
     </w:p>
-    <w:bookmarkStart w:id="137" w:name="startearly"/>
+    <w:bookmarkStart w:id="126" w:name="startearly"/>
     <w:p>
       <w:pPr>
         <w:pStyle w:val="Heading3"/>
@@ -7634,7 +7544,7 @@
         <w:t xml:space="preserve"> </w:t>
       </w:r>
       <w:r>
-        <w:t xml:space="preserve">include insight events and summer internships:</w:t>
+        <w:t xml:space="preserve">include insight days, spring week and summer internships:</w:t>
       </w:r>
     </w:p>
     <w:p>
@@ -7646,7 +7556,7 @@
         </w:numPr>
       </w:pPr>
       <w:r>
-        <w:t xml:space="preserve">Spring insights, usually occur during easter vacation, and require you to apply before (or shortly after) Christmas, see</w:t>
+        <w:t xml:space="preserve">Spring insights, usually occur during easter vacation, and require you to apply before (or shortly after) Christmas, they very in length from hours to weeks see</w:t>
       </w:r>
     </w:p>
     <w:p>
@@ -7663,7 +7573,7 @@
       <w:r>
         <w:t xml:space="preserve"> </w:t>
       </w:r>
-      <w:hyperlink r:id="rId133">
+      <w:hyperlink r:id="rId120">
         <w:r>
           <w:rPr>
             <w:rStyle w:val="Hyperlink"/>
@@ -7686,14 +7596,72 @@
       <w:r>
         <w:t xml:space="preserve"> </w:t>
       </w:r>
-      <w:hyperlink r:id="rId134">
+      <w:hyperlink r:id="rId121">
         <w:r>
           <w:rPr>
             <w:rStyle w:val="Hyperlink"/>
           </w:rPr>
-          <w:t xml:space="preserve">ratemyplacement.co.uk/insights</w:t>
+          <w:t xml:space="preserve">higherin.com/schemes/insights-spring-weeks</w:t>
         </w:r>
       </w:hyperlink>
+    </w:p>
+    <w:p>
+      <w:pPr>
+        <w:pStyle w:val="Compact"/>
+        <w:numPr>
+          <w:ilvl w:val="1"/>
+          <w:numId w:val="1010"/>
+        </w:numPr>
+      </w:pPr>
+      <w:r>
+        <w:t xml:space="preserve">The Bright Network</w:t>
+      </w:r>
+      <w:r>
+        <w:t xml:space="preserve"> </w:t>
+      </w:r>
+      <w:hyperlink r:id="rId122">
+        <w:r>
+          <w:rPr>
+            <w:rStyle w:val="Hyperlink"/>
+          </w:rPr>
+          <w:t xml:space="preserve">brightnetwork.co.uk</w:t>
+        </w:r>
+      </w:hyperlink>
+    </w:p>
+    <w:p>
+      <w:pPr>
+        <w:pStyle w:val="Compact"/>
+        <w:numPr>
+          <w:ilvl w:val="1"/>
+          <w:numId w:val="1010"/>
+        </w:numPr>
+      </w:pPr>
+      <w:r>
+        <w:t xml:space="preserve">Forage</w:t>
+      </w:r>
+      <w:r>
+        <w:t xml:space="preserve"> </w:t>
+      </w:r>
+      <w:hyperlink r:id="rId123">
+        <w:r>
+          <w:rPr>
+            <w:rStyle w:val="Hyperlink"/>
+          </w:rPr>
+          <w:t xml:space="preserve">theforage.com/</w:t>
+        </w:r>
+      </w:hyperlink>
+    </w:p>
+    <w:p>
+      <w:pPr>
+        <w:pStyle w:val="Compact"/>
+        <w:numPr>
+          <w:ilvl w:val="1"/>
+          <w:numId w:val="1010"/>
+        </w:numPr>
+      </w:pPr>
+      <w:r>
+        <w:t xml:space="preserve">… and the rest see below</w:t>
+      </w:r>
     </w:p>
     <w:p>
       <w:pPr>
@@ -7721,7 +7689,7 @@
       <w:r>
         <w:t xml:space="preserve"> </w:t>
       </w:r>
-      <w:hyperlink r:id="rId135">
+      <w:hyperlink r:id="rId124">
         <w:r>
           <w:rPr>
             <w:rStyle w:val="Hyperlink"/>
@@ -7729,6 +7697,24 @@
           <w:t xml:space="preserve">bit.ly/gradcracker-first-years</w:t>
         </w:r>
       </w:hyperlink>
+      <w:r>
+        <w:t xml:space="preserve">, adjust the</w:t>
+      </w:r>
+      <w:r>
+        <w:t xml:space="preserve"> </w:t>
+      </w:r>
+      <w:r>
+        <w:rPr>
+          <w:rStyle w:val="VerbatimChar"/>
+        </w:rPr>
+        <w:t xml:space="preserve">PLACEMENT DURATION</w:t>
+      </w:r>
+      <w:r>
+        <w:t xml:space="preserve"> </w:t>
+      </w:r>
+      <w:r>
+        <w:t xml:space="preserve">parameter in the search</w:t>
+      </w:r>
     </w:p>
     <w:p>
       <w:pPr>
@@ -7744,14 +7730,28 @@
       <w:r>
         <w:t xml:space="preserve"> </w:t>
       </w:r>
-      <w:hyperlink r:id="rId136">
+      <w:r>
+        <w:rPr>
+          <w:i/>
+          <w:iCs/>
+        </w:rPr>
+        <w:t xml:space="preserve">Finding Your Future</w:t>
+      </w:r>
+      <w:r>
+        <w:t xml:space="preserve"> </w:t>
+      </w:r>
+      <w:r>
+        <w:t xml:space="preserve">at</w:t>
+      </w:r>
+      <w:r>
+        <w:t xml:space="preserve"> </w:t>
+      </w:r>
+      <w:hyperlink r:id="rId125">
         <w:r>
           <w:rPr>
             <w:rStyle w:val="Hyperlink"/>
-            <w:i/>
-            <w:iCs/>
           </w:rPr>
-          <w:t xml:space="preserve">Finding your Future</w:t>
+          <w:t xml:space="preserve">cdyf.me/finding</w:t>
         </w:r>
       </w:hyperlink>
       <w:r>
@@ -7781,7 +7781,7 @@
           <w:rPr>
             <w:rStyle w:val="Hyperlink"/>
           </w:rPr>
-          <w:t xml:space="preserve">Hull 2024b</w:t>
+          <w:t xml:space="preserve">Hull 2026b</w:t>
         </w:r>
       </w:hyperlink>
       <w:r>
@@ -7794,8 +7794,8 @@
         <w:t xml:space="preserve">for other places you can look</w:t>
       </w:r>
     </w:p>
-    <w:bookmarkEnd w:id="137"/>
-    <w:bookmarkStart w:id="139" w:name="afterfirst"/>
+    <w:bookmarkEnd w:id="126"/>
+    <w:bookmarkStart w:id="128" w:name="afterfirst"/>
     <w:p>
       <w:pPr>
         <w:pStyle w:val="Heading3"/>
@@ -7851,7 +7851,7 @@
       <w:r>
         <w:t xml:space="preserve"> </w:t>
       </w:r>
-      <w:hyperlink r:id="rId138">
+      <w:hyperlink r:id="rId127">
         <w:r>
           <w:rPr>
             <w:rStyle w:val="Hyperlink"/>
@@ -7923,12 +7923,12 @@
         <w:pStyle w:val="FirstParagraph"/>
       </w:pPr>
       <w:r>
-        <w:t xml:space="preserve">Any time you invest in creating a convincing CV will pay off in the long run. Yes, you’ve only just started University, so might not have much to talk about just yet, but it’s never too early to make a start.</w:t>
-      </w:r>
-    </w:p>
-    <w:bookmarkEnd w:id="139"/>
-    <w:bookmarkEnd w:id="140"/>
-    <w:bookmarkStart w:id="141" w:name="ex5"/>
+        <w:t xml:space="preserve">Any time you invest in creating a convincing CV will pay off in the long run. Yes, you’ve only just started University, so might not have much to talk about just yet, but it’s never too early to make a start and it will help you identify where the gaps are.</w:t>
+      </w:r>
+    </w:p>
+    <w:bookmarkEnd w:id="128"/>
+    <w:bookmarkEnd w:id="129"/>
+    <w:bookmarkStart w:id="130" w:name="ex5"/>
     <w:p>
       <w:pPr>
         <w:pStyle w:val="Heading2"/>
@@ -7951,7 +7951,7 @@
         <w:pStyle w:val="FirstParagraph"/>
       </w:pPr>
       <w:r>
-        <w:t xml:space="preserve">Create a basic CV which tells your story, in particular:</w:t>
+        <w:t xml:space="preserve">Create a basic CV which tells your story so far. We suggest you start with around five sections which cover:</w:t>
       </w:r>
     </w:p>
     <w:p>
@@ -7963,20 +7963,20 @@
         </w:numPr>
       </w:pPr>
       <w:r>
-        <w:t xml:space="preserve">your</w:t>
-      </w:r>
-      <w:r>
-        <w:t xml:space="preserve"> </w:t>
-      </w:r>
-      <w:r>
-        <w:rPr>
-          <w:i/>
-          <w:iCs/>
-        </w:rPr>
-        <w:t xml:space="preserve">education</w:t>
-      </w:r>
-      <w:r>
-        <w:t xml:space="preserve">, including high school and University</w:t>
+        <w:t xml:space="preserve">Your</w:t>
+      </w:r>
+      <w:r>
+        <w:t xml:space="preserve"> </w:t>
+      </w:r>
+      <w:r>
+        <w:rPr>
+          <w:b/>
+          <w:bCs/>
+        </w:rPr>
+        <w:t xml:space="preserve">EDUCATION</w:t>
+      </w:r>
+      <w:r>
+        <w:t xml:space="preserve">: University first with high school after, in reverse chronological order</w:t>
       </w:r>
     </w:p>
     <w:p>
@@ -7988,36 +7988,20 @@
         </w:numPr>
       </w:pPr>
       <w:r>
-        <w:t xml:space="preserve">your</w:t>
-      </w:r>
-      <w:r>
-        <w:t xml:space="preserve"> </w:t>
-      </w:r>
-      <w:r>
-        <w:rPr>
-          <w:i/>
-          <w:iCs/>
-        </w:rPr>
-        <w:t xml:space="preserve">experience</w:t>
-      </w:r>
-      <w:r>
-        <w:t xml:space="preserve">, voluntary, paid, casual, technical and non-technical:</w:t>
-      </w:r>
-      <w:r>
-        <w:t xml:space="preserve"> </w:t>
-      </w:r>
-      <w:r>
-        <w:rPr>
-          <w:i/>
-          <w:iCs/>
-        </w:rPr>
-        <w:t xml:space="preserve">any</w:t>
-      </w:r>
-      <w:r>
-        <w:t xml:space="preserve"> </w:t>
-      </w:r>
-      <w:r>
-        <w:t xml:space="preserve">experience demonstrates your range of soft and hard skills</w:t>
+        <w:t xml:space="preserve">Your</w:t>
+      </w:r>
+      <w:r>
+        <w:t xml:space="preserve"> </w:t>
+      </w:r>
+      <w:r>
+        <w:rPr>
+          <w:b/>
+          <w:bCs/>
+        </w:rPr>
+        <w:t xml:space="preserve">EXPERIENCE</w:t>
+      </w:r>
+      <w:r>
+        <w:t xml:space="preserve">: voluntary, paid, casual, technical, and non-technical — all experience shows your range of soft and hard skills</w:t>
       </w:r>
     </w:p>
     <w:p>
@@ -8029,20 +8013,70 @@
         </w:numPr>
       </w:pPr>
       <w:r>
-        <w:t xml:space="preserve">your</w:t>
-      </w:r>
-      <w:r>
-        <w:t xml:space="preserve"> </w:t>
-      </w:r>
-      <w:r>
-        <w:rPr>
-          <w:i/>
-          <w:iCs/>
-        </w:rPr>
-        <w:t xml:space="preserve">projects</w:t>
-      </w:r>
-      <w:r>
-        <w:t xml:space="preserve">, personal, social, educational and entrepreneurial</w:t>
+        <w:t xml:space="preserve">Your</w:t>
+      </w:r>
+      <w:r>
+        <w:t xml:space="preserve"> </w:t>
+      </w:r>
+      <w:r>
+        <w:rPr>
+          <w:b/>
+          <w:bCs/>
+        </w:rPr>
+        <w:t xml:space="preserve">PROJECTS</w:t>
+      </w:r>
+      <w:r>
+        <w:t xml:space="preserve">: solo, social, side-projects, hackathons, coursework or perhaps extra-curricular projects you’ve done, including non-technical work</w:t>
+      </w:r>
+    </w:p>
+    <w:p>
+      <w:pPr>
+        <w:pStyle w:val="Compact"/>
+        <w:numPr>
+          <w:ilvl w:val="0"/>
+          <w:numId w:val="1013"/>
+        </w:numPr>
+      </w:pPr>
+      <w:r>
+        <w:t xml:space="preserve">Your</w:t>
+      </w:r>
+      <w:r>
+        <w:t xml:space="preserve"> </w:t>
+      </w:r>
+      <w:r>
+        <w:rPr>
+          <w:b/>
+          <w:bCs/>
+        </w:rPr>
+        <w:t xml:space="preserve">AWARDS &amp; LEADERSHIP</w:t>
+      </w:r>
+      <w:r>
+        <w:t xml:space="preserve">: any prizes you’ve won or certifications you are working towards alongside any positions of responsibility you’ve held (or are about to take on)</w:t>
+      </w:r>
+    </w:p>
+    <w:p>
+      <w:pPr>
+        <w:pStyle w:val="Compact"/>
+        <w:numPr>
+          <w:ilvl w:val="0"/>
+          <w:numId w:val="1013"/>
+        </w:numPr>
+      </w:pPr>
+      <w:r>
+        <w:t xml:space="preserve">Your</w:t>
+      </w:r>
+      <w:r>
+        <w:t xml:space="preserve"> </w:t>
+      </w:r>
+      <w:r>
+        <w:rPr>
+          <w:b/>
+          <w:bCs/>
+        </w:rPr>
+        <w:t xml:space="preserve">ETC</w:t>
+      </w:r>
+      <w:r>
+        <w:t xml:space="preserve">: it might be listing your key skills, relevant hobbies, maybe a personal statement - make it your own by personalising it and tailoring it to the kind of roles you think you might be interested in</w:t>
       </w:r>
     </w:p>
     <w:p>
@@ -8050,12 +8084,12 @@
         <w:pStyle w:val="FirstParagraph"/>
       </w:pPr>
       <w:r>
-        <w:t xml:space="preserve">You can do this using the ready-made templates at</w:t>
-      </w:r>
-      <w:r>
-        <w:t xml:space="preserve"> </w:t>
-      </w:r>
-      <w:hyperlink r:id="rId132">
+        <w:t xml:space="preserve">You can use the ready-made templates at</w:t>
+      </w:r>
+      <w:r>
+        <w:t xml:space="preserve"> </w:t>
+      </w:r>
+      <w:hyperlink r:id="rId119">
         <w:r>
           <w:rPr>
             <w:rStyle w:val="Hyperlink"/>
@@ -8067,8 +8101,8 @@
         <w:t xml:space="preserve">. Have a good look around, there are over 600 templates to choose from.</w:t>
       </w:r>
     </w:p>
-    <w:bookmarkEnd w:id="141"/>
-    <w:bookmarkStart w:id="143" w:name="weird"/>
+    <w:bookmarkEnd w:id="130"/>
+    <w:bookmarkStart w:id="132" w:name="weird"/>
     <w:p>
       <w:pPr>
         <w:pStyle w:val="Heading2"/>
@@ -8096,7 +8130,7 @@
       <w:r>
         <w:t xml:space="preserve"> </w:t>
       </w:r>
-      <w:hyperlink r:id="rId142">
+      <w:hyperlink r:id="rId131">
         <w:r>
           <w:rPr>
             <w:rStyle w:val="Hyperlink"/>
@@ -8164,8 +8198,8 @@
         <w:t xml:space="preserve">{cdyf.me}}}</w:t>
       </w:r>
     </w:p>
-    <w:bookmarkEnd w:id="143"/>
-    <w:bookmarkStart w:id="149" w:name="debugging-your-cv-checklist"/>
+    <w:bookmarkEnd w:id="132"/>
+    <w:bookmarkStart w:id="138" w:name="debugging-your-cv-checklist"/>
     <w:p>
       <w:pPr>
         <w:pStyle w:val="Heading2"/>
@@ -8188,19 +8222,7 @@
         <w:pStyle w:val="FirstParagraph"/>
       </w:pPr>
       <w:r>
-        <w:t xml:space="preserve">As you progress through University, continuously update your CV and solicit feedback from as many people as you can. Your fellow students, personal tutors, friends, family and anyone else you trust can all give you valuable feedback. There will be opportunities to debug your CV later, but you’ll need a</w:t>
-      </w:r>
-      <w:r>
-        <w:t xml:space="preserve"> </w:t>
-      </w:r>
-      <w:r>
-        <w:t xml:space="preserve">“beta release”</w:t>
-      </w:r>
-      <w:r>
-        <w:t xml:space="preserve"> </w:t>
-      </w:r>
-      <w:r>
-        <w:t xml:space="preserve">(version 1.0) of your CV to get started. The best time to start debugging is now, so that you can squash any bugs before employers see them. Innocent bugs</w:t>
+        <w:t xml:space="preserve">As you progress through University, continuously update your CV and solicit feedback from as many people as you can. Your fellow students, personal tutors, friends, family and anyone else you trust can all give you valuable feedback. There will be opportunities to debug your CV later, but you’ll need a “beta release” (version 1.0) of your CV to get started. The best time to start debugging is now, so that you can squash any bugs before employers see them. Innocent bugs</w:t>
       </w:r>
       <w:r>
         <w:t xml:space="preserve"> </w:t>
@@ -8293,14 +8315,14 @@
       <w:r>
         <w:t xml:space="preserve"> </w:t>
       </w:r>
-      <w:hyperlink r:id="rId144">
+      <w:hyperlink r:id="rId133">
         <w:r>
           <w:rPr>
             <w:rStyle w:val="Hyperlink"/>
             <w:i/>
             <w:iCs/>
           </w:rPr>
-          <w:t xml:space="preserve">Verbalising your Future</w:t>
+          <w:t xml:space="preserve">Verbalising Your Future</w:t>
         </w:r>
       </w:hyperlink>
       <w:r>
@@ -8359,12 +8381,12 @@
         </w:numPr>
       </w:pPr>
       <w:r>
-        <w:t xml:space="preserve">Is your CV robot proof? Many large employers use automated applicant tracking systems that use software to screen CVs long before a human ever sees them. You can feed your CV through software like</w:t>
-      </w:r>
-      <w:r>
-        <w:t xml:space="preserve"> </w:t>
-      </w:r>
-      <w:hyperlink r:id="rId145">
+        <w:t xml:space="preserve">Is your CV robot and AI proof? Many large employers use automated Applicant Tracking Systems (ATS): software that screens CVs long before a human ever sees them. Once you’ve anonymised it, you can get feedback from bots and AI like</w:t>
+      </w:r>
+      <w:r>
+        <w:t xml:space="preserve"> </w:t>
+      </w:r>
+      <w:hyperlink r:id="rId134">
         <w:r>
           <w:rPr>
             <w:rStyle w:val="Hyperlink"/>
@@ -8373,15 +8395,12 @@
         </w:r>
       </w:hyperlink>
       <w:r>
-        <w:t xml:space="preserve"> </w:t>
-      </w:r>
-      <w:r>
-        <w:t xml:space="preserve">and</w:t>
-      </w:r>
-      <w:r>
-        <w:t xml:space="preserve"> </w:t>
-      </w:r>
-      <w:hyperlink r:id="rId146">
+        <w:t xml:space="preserve">,</w:t>
+      </w:r>
+      <w:r>
+        <w:t xml:space="preserve"> </w:t>
+      </w:r>
+      <w:hyperlink r:id="rId135">
         <w:r>
           <w:rPr>
             <w:rStyle w:val="Hyperlink"/>
@@ -8390,7 +8409,10 @@
         </w:r>
       </w:hyperlink>
       <w:r>
-        <w:t xml:space="preserve">, what feedback do the robots give you? How can you make your CV more robot proof?</w:t>
+        <w:t xml:space="preserve"> </w:t>
+      </w:r>
+      <w:r>
+        <w:t xml:space="preserve">and your favourite LLM. What feedback do the robots give you? How can you make your CV more robot proof? What prompts can you use to get constructive and critical feedback?</w:t>
       </w:r>
     </w:p>
     <w:p>
@@ -8412,7 +8434,7 @@
           <w:i/>
           <w:iCs/>
         </w:rPr>
-        <w:t xml:space="preserve">debugging your future</w:t>
+        <w:t xml:space="preserve">Debugging Your Future</w:t>
       </w:r>
       <w:r>
         <w:t xml:space="preserve"> </w:t>
@@ -8423,7 +8445,7 @@
       <w:r>
         <w:t xml:space="preserve"> </w:t>
       </w:r>
-      <w:hyperlink r:id="rId147">
+      <w:hyperlink r:id="rId136">
         <w:r>
           <w:rPr>
             <w:rStyle w:val="Hyperlink"/>
@@ -8442,7 +8464,7 @@
           <w:rPr>
             <w:rStyle w:val="Hyperlink"/>
           </w:rPr>
-          <w:t xml:space="preserve">Hull 2024a</w:t>
+          <w:t xml:space="preserve">Hull 2026a</w:t>
         </w:r>
       </w:hyperlink>
       <w:r>
@@ -8458,59 +8480,22 @@
         </w:numPr>
       </w:pPr>
       <w:r>
-        <w:t xml:space="preserve">If you’re a University of Manchester student, take a look at the CV pathway from the careers service at</w:t>
-      </w:r>
-      <w:r>
-        <w:t xml:space="preserve"> </w:t>
-      </w:r>
-      <w:hyperlink r:id="rId148">
+        <w:t xml:space="preserve">Explore the advice and services provided by the careers service at</w:t>
+      </w:r>
+      <w:r>
+        <w:t xml:space="preserve"> </w:t>
+      </w:r>
+      <w:hyperlink r:id="rId137">
         <w:r>
           <w:rPr>
             <w:rStyle w:val="Hyperlink"/>
           </w:rPr>
-          <w:t xml:space="preserve">bit.ly/uomcvpathway</w:t>
+          <w:t xml:space="preserve">www.careers.manchester.ac.uk/applicationsinterviews/cv</w:t>
         </w:r>
       </w:hyperlink>
-      <w:r>
-        <w:t xml:space="preserve"> </w:t>
-      </w:r>
-      <w:r>
-        <w:t xml:space="preserve">which requires a</w:t>
-      </w:r>
-      <w:r>
-        <w:t xml:space="preserve"> </w:t>
-      </w:r>
-      <w:r>
-        <w:rPr>
-          <w:rStyle w:val="VerbatimChar"/>
-        </w:rPr>
-        <w:t xml:space="preserve">careerconnect.manchester.ac.uk</w:t>
-      </w:r>
-      <w:r>
-        <w:t xml:space="preserve"> </w:t>
-      </w:r>
-      <w:r>
-        <w:t xml:space="preserve">login - unfortunately</w:t>
-      </w:r>
-      <w:r>
-        <w:t xml:space="preserve"> </w:t>
-      </w:r>
-      <w:r>
-        <w:rPr>
-          <w:i/>
-          <w:iCs/>
-        </w:rPr>
-        <w:t xml:space="preserve">not</w:t>
-      </w:r>
-      <w:r>
-        <w:t xml:space="preserve"> </w:t>
-      </w:r>
-      <w:r>
-        <w:t xml:space="preserve">the same as your University credentials</w:t>
-      </w:r>
-    </w:p>
-    <w:bookmarkEnd w:id="149"/>
-    <w:bookmarkStart w:id="150" w:name="cvconc"/>
+    </w:p>
+    <w:bookmarkEnd w:id="138"/>
+    <w:bookmarkStart w:id="139" w:name="cvconc"/>
     <w:p>
       <w:pPr>
         <w:pStyle w:val="Heading2"/>
@@ -8604,9 +8589,9 @@
         <w:t xml:space="preserve">…and more.</w:t>
       </w:r>
     </w:p>
-    <w:bookmarkEnd w:id="150"/>
-    <w:bookmarkEnd w:id="151"/>
-    <w:bookmarkStart w:id="152" w:name="appendix"/>
+    <w:bookmarkEnd w:id="139"/>
+    <w:bookmarkEnd w:id="140"/>
+    <w:bookmarkStart w:id="141" w:name="appendix"/>
     <w:p>
       <w:pPr>
         <w:pStyle w:val="Heading1"/>
@@ -8615,8 +8600,8 @@
         <w:t xml:space="preserve">Appendix</w:t>
       </w:r>
     </w:p>
-    <w:bookmarkEnd w:id="152"/>
-    <w:bookmarkStart w:id="177" w:name="typography"/>
+    <w:bookmarkEnd w:id="141"/>
+    <w:bookmarkStart w:id="166" w:name="typography"/>
     <w:p>
       <w:pPr>
         <w:pStyle w:val="Heading1"/>
@@ -8644,7 +8629,7 @@
       <w:r>
         <w:t xml:space="preserve"> </w:t>
       </w:r>
-      <w:hyperlink r:id="rId153">
+      <w:hyperlink r:id="rId142">
         <w:r>
           <w:rPr>
             <w:rStyle w:val="Hyperlink"/>
@@ -8661,7 +8646,7 @@
       <w:r>
         <w:t xml:space="preserve"> </w:t>
       </w:r>
-      <w:hyperlink r:id="rId154">
+      <w:hyperlink r:id="rId143">
         <w:r>
           <w:rPr>
             <w:rStyle w:val="Hyperlink"/>
@@ -8676,8 +8661,8 @@
         <w:t xml:space="preserve">etc.</w:t>
       </w:r>
     </w:p>
-    <w:bookmarkStart w:id="176" w:name="refs"/>
-    <w:bookmarkStart w:id="156" w:name="ref-googlescholar"/>
+    <w:bookmarkStart w:id="165" w:name="refs"/>
+    <w:bookmarkStart w:id="145" w:name="ref-googlescholar"/>
     <w:p>
       <w:pPr>
         <w:pStyle w:val="Bibliography"/>
@@ -8689,36 +8674,47 @@
         <w:t xml:space="preserve"> </w:t>
       </w:r>
       <w:r>
-        <w:t xml:space="preserve">“</w:t>
-      </w:r>
-      <w:r>
+        <w:rPr>
+          <w:i/>
+          <w:iCs/>
+        </w:rPr>
         <w:t xml:space="preserve">Alan</w:t>
       </w:r>
       <w:r>
-        <w:t xml:space="preserve"> </w:t>
-      </w:r>
-      <w:r>
+        <w:rPr>
+          <w:i/>
+          <w:iCs/>
+        </w:rPr>
+        <w:t xml:space="preserve"> </w:t>
+      </w:r>
+      <w:r>
+        <w:rPr>
+          <w:i/>
+          <w:iCs/>
+        </w:rPr>
         <w:t xml:space="preserve">Turing’s</w:t>
       </w:r>
       <w:r>
-        <w:t xml:space="preserve"> </w:t>
-      </w:r>
-      <w:r>
+        <w:rPr>
+          <w:i/>
+          <w:iCs/>
+        </w:rPr>
+        <w:t xml:space="preserve"> </w:t>
+      </w:r>
+      <w:r>
+        <w:rPr>
+          <w:i/>
+          <w:iCs/>
+        </w:rPr>
         <w:t xml:space="preserve">Publications</w:t>
       </w:r>
       <w:r>
-        <w:t xml:space="preserve">.”</w:t>
-      </w:r>
-      <w:r>
-        <w:t xml:space="preserve"> </w:t>
-      </w:r>
-      <w:r>
-        <w:t xml:space="preserve">scholar.google.com.</w:t>
-      </w:r>
-      <w:r>
-        <w:t xml:space="preserve"> </w:t>
-      </w:r>
-      <w:hyperlink r:id="rId155">
+        <w:t xml:space="preserve">. Scholar.google.com.</w:t>
+      </w:r>
+      <w:r>
+        <w:t xml:space="preserve"> </w:t>
+      </w:r>
+      <w:hyperlink r:id="rId144">
         <w:r>
           <w:rPr>
             <w:rStyle w:val="Hyperlink"/>
@@ -8730,8 +8726,8 @@
         <w:t xml:space="preserve">.</w:t>
       </w:r>
     </w:p>
-    <w:bookmarkEnd w:id="156"/>
-    <w:bookmarkStart w:id="158" w:name="ref-codinghorror"/>
+    <w:bookmarkEnd w:id="145"/>
+    <w:bookmarkStart w:id="147" w:name="ref-codinghorror"/>
     <w:p>
       <w:pPr>
         <w:pStyle w:val="Bibliography"/>
@@ -8743,63 +8739,110 @@
         <w:t xml:space="preserve"> </w:t>
       </w:r>
       <w:r>
-        <w:t xml:space="preserve">“</w:t>
-      </w:r>
-      <w:r>
+        <w:rPr>
+          <w:i/>
+          <w:iCs/>
+        </w:rPr>
         <w:t xml:space="preserve">Practicing</w:t>
       </w:r>
       <w:r>
-        <w:t xml:space="preserve"> </w:t>
-      </w:r>
-      <w:r>
+        <w:rPr>
+          <w:i/>
+          <w:iCs/>
+        </w:rPr>
+        <w:t xml:space="preserve"> </w:t>
+      </w:r>
+      <w:r>
+        <w:rPr>
+          <w:i/>
+          <w:iCs/>
+        </w:rPr>
         <w:t xml:space="preserve">the</w:t>
       </w:r>
       <w:r>
-        <w:t xml:space="preserve"> </w:t>
-      </w:r>
-      <w:r>
+        <w:rPr>
+          <w:i/>
+          <w:iCs/>
+        </w:rPr>
+        <w:t xml:space="preserve"> </w:t>
+      </w:r>
+      <w:r>
+        <w:rPr>
+          <w:i/>
+          <w:iCs/>
+        </w:rPr>
         <w:t xml:space="preserve">Fundamentals</w:t>
       </w:r>
       <w:r>
+        <w:rPr>
+          <w:i/>
+          <w:iCs/>
+        </w:rPr>
         <w:t xml:space="preserve">:</w:t>
       </w:r>
       <w:r>
-        <w:t xml:space="preserve"> </w:t>
-      </w:r>
-      <w:r>
+        <w:rPr>
+          <w:i/>
+          <w:iCs/>
+        </w:rPr>
+        <w:t xml:space="preserve"> </w:t>
+      </w:r>
+      <w:r>
+        <w:rPr>
+          <w:i/>
+          <w:iCs/>
+        </w:rPr>
         <w:t xml:space="preserve">The</w:t>
       </w:r>
       <w:r>
-        <w:t xml:space="preserve"> </w:t>
-      </w:r>
-      <w:r>
+        <w:rPr>
+          <w:i/>
+          <w:iCs/>
+        </w:rPr>
+        <w:t xml:space="preserve"> </w:t>
+      </w:r>
+      <w:r>
+        <w:rPr>
+          <w:i/>
+          <w:iCs/>
+        </w:rPr>
         <w:t xml:space="preserve">New</w:t>
       </w:r>
       <w:r>
-        <w:t xml:space="preserve"> </w:t>
-      </w:r>
-      <w:r>
+        <w:rPr>
+          <w:i/>
+          <w:iCs/>
+        </w:rPr>
+        <w:t xml:space="preserve"> </w:t>
+      </w:r>
+      <w:r>
+        <w:rPr>
+          <w:i/>
+          <w:iCs/>
+        </w:rPr>
         <w:t xml:space="preserve">Turing</w:t>
       </w:r>
       <w:r>
-        <w:t xml:space="preserve"> </w:t>
-      </w:r>
-      <w:r>
+        <w:rPr>
+          <w:i/>
+          <w:iCs/>
+        </w:rPr>
+        <w:t xml:space="preserve"> </w:t>
+      </w:r>
+      <w:r>
+        <w:rPr>
+          <w:i/>
+          <w:iCs/>
+        </w:rPr>
         <w:t xml:space="preserve">Omnibus</w:t>
       </w:r>
       <w:r>
-        <w:t xml:space="preserve">.”</w:t>
-      </w:r>
-      <w:r>
-        <w:t xml:space="preserve"> </w:t>
-      </w:r>
-      <w:r>
-        <w:t xml:space="preserve">codinghorror.com.</w:t>
-      </w:r>
-      <w:r>
-        <w:t xml:space="preserve"> </w:t>
-      </w:r>
-      <w:hyperlink r:id="rId157">
+        <w:t xml:space="preserve">. Codinghorror.com.</w:t>
+      </w:r>
+      <w:r>
+        <w:t xml:space="preserve"> </w:t>
+      </w:r>
+      <w:hyperlink r:id="rId146">
         <w:r>
           <w:rPr>
             <w:rStyle w:val="Hyperlink"/>
@@ -8811,8 +8854,8 @@
         <w:t xml:space="preserve">.</w:t>
       </w:r>
     </w:p>
-    <w:bookmarkEnd w:id="158"/>
-    <w:bookmarkStart w:id="160" w:name="ref-turingomnibus"/>
+    <w:bookmarkEnd w:id="147"/>
+    <w:bookmarkStart w:id="149" w:name="ref-turingomnibus"/>
     <w:p>
       <w:pPr>
         <w:pStyle w:val="Bibliography"/>
@@ -8908,12 +8951,12 @@
         <w:t xml:space="preserve">Science</w:t>
       </w:r>
       <w:r>
-        <w:t xml:space="preserve">. New York: Henry Holt.</w:t>
-      </w:r>
-      <w:r>
-        <w:t xml:space="preserve"> </w:t>
-      </w:r>
-      <w:hyperlink r:id="rId159">
+        <w:t xml:space="preserve">. Henry Holt.</w:t>
+      </w:r>
+      <w:r>
+        <w:t xml:space="preserve"> </w:t>
+      </w:r>
+      <w:hyperlink r:id="rId148">
         <w:r>
           <w:rPr>
             <w:rStyle w:val="Hyperlink"/>
@@ -8925,26 +8968,38 @@
         <w:t xml:space="preserve">.</w:t>
       </w:r>
     </w:p>
-    <w:bookmarkEnd w:id="160"/>
-    <w:bookmarkStart w:id="162" w:name="ref-debugyourfuture"/>
+    <w:bookmarkEnd w:id="149"/>
+    <w:bookmarkStart w:id="151" w:name="ref-debugyourfuture"/>
     <w:p>
       <w:pPr>
         <w:pStyle w:val="Bibliography"/>
       </w:pPr>
       <w:r>
-        <w:t xml:space="preserve">Hull, Duncan. 2024a.</w:t>
-      </w:r>
-      <w:r>
-        <w:t xml:space="preserve"> </w:t>
-      </w:r>
-      <w:r>
-        <w:t xml:space="preserve">“Debugging Your Future.”</w:t>
-      </w:r>
-      <w:r>
-        <w:t xml:space="preserve"> </w:t>
-      </w:r>
-      <w:r>
-        <w:t xml:space="preserve">In</w:t>
+        <w:t xml:space="preserve">Hull, Duncan. 2026a.</w:t>
+      </w:r>
+      <w:r>
+        <w:t xml:space="preserve"> </w:t>
+      </w:r>
+      <w:r>
+        <w:t xml:space="preserve">“Debugging</w:t>
+      </w:r>
+      <w:r>
+        <w:t xml:space="preserve"> </w:t>
+      </w:r>
+      <w:r>
+        <w:t xml:space="preserve">Y</w:t>
+      </w:r>
+      <w:r>
+        <w:t xml:space="preserve">our</w:t>
+      </w:r>
+      <w:r>
+        <w:t xml:space="preserve"> </w:t>
+      </w:r>
+      <w:r>
+        <w:t xml:space="preserve">F</w:t>
+      </w:r>
+      <w:r>
+        <w:t xml:space="preserve">uture.”</w:t>
       </w:r>
       <w:r>
         <w:t xml:space="preserve"> </w:t>
@@ -8957,12 +9012,12 @@
         <w:t xml:space="preserve">Coding Your Future: A Guidebook for Students</w:t>
       </w:r>
       <w:r>
-        <w:t xml:space="preserve">. University of Manchester; github.com.</w:t>
-      </w:r>
-      <w:r>
-        <w:t xml:space="preserve"> </w:t>
-      </w:r>
-      <w:hyperlink r:id="rId161">
+        <w:t xml:space="preserve">.</w:t>
+      </w:r>
+      <w:r>
+        <w:t xml:space="preserve"> </w:t>
+      </w:r>
+      <w:hyperlink r:id="rId150">
         <w:r>
           <w:rPr>
             <w:rStyle w:val="Hyperlink"/>
@@ -8974,26 +9029,38 @@
         <w:t xml:space="preserve">.</w:t>
       </w:r>
     </w:p>
-    <w:bookmarkEnd w:id="162"/>
-    <w:bookmarkStart w:id="163" w:name="ref-findingyourfuture"/>
+    <w:bookmarkEnd w:id="151"/>
+    <w:bookmarkStart w:id="152" w:name="ref-findingyourfuture"/>
     <w:p>
       <w:pPr>
         <w:pStyle w:val="Bibliography"/>
       </w:pPr>
       <w:r>
-        <w:t xml:space="preserve">———. 2024b.</w:t>
-      </w:r>
-      <w:r>
-        <w:t xml:space="preserve"> </w:t>
-      </w:r>
-      <w:r>
-        <w:t xml:space="preserve">“Finding Your Future.”</w:t>
-      </w:r>
-      <w:r>
-        <w:t xml:space="preserve"> </w:t>
-      </w:r>
-      <w:r>
-        <w:t xml:space="preserve">In</w:t>
+        <w:t xml:space="preserve">Hull, Duncan. 2026b.</w:t>
+      </w:r>
+      <w:r>
+        <w:t xml:space="preserve"> </w:t>
+      </w:r>
+      <w:r>
+        <w:t xml:space="preserve">“Finding</w:t>
+      </w:r>
+      <w:r>
+        <w:t xml:space="preserve"> </w:t>
+      </w:r>
+      <w:r>
+        <w:t xml:space="preserve">Y</w:t>
+      </w:r>
+      <w:r>
+        <w:t xml:space="preserve">our</w:t>
+      </w:r>
+      <w:r>
+        <w:t xml:space="preserve"> </w:t>
+      </w:r>
+      <w:r>
+        <w:t xml:space="preserve">F</w:t>
+      </w:r>
+      <w:r>
+        <w:t xml:space="preserve">uture.”</w:t>
       </w:r>
       <w:r>
         <w:t xml:space="preserve"> </w:t>
@@ -9003,15 +9070,99 @@
           <w:i/>
           <w:iCs/>
         </w:rPr>
-        <w:t xml:space="preserve">Coding Your Future: A Guidebook for Students</w:t>
-      </w:r>
-      <w:r>
-        <w:t xml:space="preserve">. University of Manchester; github.com.</w:t>
-      </w:r>
-      <w:r>
-        <w:t xml:space="preserve"> </w:t>
-      </w:r>
-      <w:hyperlink r:id="rId136">
+        <w:t xml:space="preserve">Coding</w:t>
+      </w:r>
+      <w:r>
+        <w:rPr>
+          <w:i/>
+          <w:iCs/>
+        </w:rPr>
+        <w:t xml:space="preserve"> </w:t>
+      </w:r>
+      <w:r>
+        <w:rPr>
+          <w:i/>
+          <w:iCs/>
+        </w:rPr>
+        <w:t xml:space="preserve">Y</w:t>
+      </w:r>
+      <w:r>
+        <w:rPr>
+          <w:i/>
+          <w:iCs/>
+        </w:rPr>
+        <w:t xml:space="preserve">our</w:t>
+      </w:r>
+      <w:r>
+        <w:rPr>
+          <w:i/>
+          <w:iCs/>
+        </w:rPr>
+        <w:t xml:space="preserve"> </w:t>
+      </w:r>
+      <w:r>
+        <w:rPr>
+          <w:i/>
+          <w:iCs/>
+        </w:rPr>
+        <w:t xml:space="preserve">F</w:t>
+      </w:r>
+      <w:r>
+        <w:rPr>
+          <w:i/>
+          <w:iCs/>
+        </w:rPr>
+        <w:t xml:space="preserve">uture: A</w:t>
+      </w:r>
+      <w:r>
+        <w:rPr>
+          <w:i/>
+          <w:iCs/>
+        </w:rPr>
+        <w:t xml:space="preserve"> </w:t>
+      </w:r>
+      <w:r>
+        <w:rPr>
+          <w:i/>
+          <w:iCs/>
+        </w:rPr>
+        <w:t xml:space="preserve">G</w:t>
+      </w:r>
+      <w:r>
+        <w:rPr>
+          <w:i/>
+          <w:iCs/>
+        </w:rPr>
+        <w:t xml:space="preserve">uidebook for</w:t>
+      </w:r>
+      <w:r>
+        <w:rPr>
+          <w:i/>
+          <w:iCs/>
+        </w:rPr>
+        <w:t xml:space="preserve"> </w:t>
+      </w:r>
+      <w:r>
+        <w:rPr>
+          <w:i/>
+          <w:iCs/>
+        </w:rPr>
+        <w:t xml:space="preserve">S</w:t>
+      </w:r>
+      <w:r>
+        <w:rPr>
+          <w:i/>
+          <w:iCs/>
+        </w:rPr>
+        <w:t xml:space="preserve">tudents</w:t>
+      </w:r>
+      <w:r>
+        <w:t xml:space="preserve">.</w:t>
+      </w:r>
+      <w:r>
+        <w:t xml:space="preserve"> </w:t>
+      </w:r>
+      <w:hyperlink r:id="rId125">
         <w:r>
           <w:rPr>
             <w:rStyle w:val="Hyperlink"/>
@@ -9023,8 +9174,8 @@
         <w:t xml:space="preserve">.</w:t>
       </w:r>
     </w:p>
-    <w:bookmarkEnd w:id="163"/>
-    <w:bookmarkStart w:id="165" w:name="ref-knuth"/>
+    <w:bookmarkEnd w:id="152"/>
+    <w:bookmarkStart w:id="154" w:name="ref-knuth"/>
     <w:p>
       <w:pPr>
         <w:pStyle w:val="Bibliography"/>
@@ -9057,12 +9208,12 @@
         <w:t xml:space="preserve">TeXbook</w:t>
       </w:r>
       <w:r>
-        <w:t xml:space="preserve">. Boston, Massachusetts: Addison-Wesley.</w:t>
-      </w:r>
-      <w:r>
-        <w:t xml:space="preserve"> </w:t>
-      </w:r>
-      <w:hyperlink r:id="rId164">
+        <w:t xml:space="preserve">. Addison-Wesley.</w:t>
+      </w:r>
+      <w:r>
+        <w:t xml:space="preserve"> </w:t>
+      </w:r>
+      <w:hyperlink r:id="rId153">
         <w:r>
           <w:rPr>
             <w:rStyle w:val="Hyperlink"/>
@@ -9074,8 +9225,8 @@
         <w:t xml:space="preserve">.</w:t>
       </w:r>
     </w:p>
-    <w:bookmarkEnd w:id="165"/>
-    <w:bookmarkStart w:id="167" w:name="ref-kopka"/>
+    <w:bookmarkEnd w:id="154"/>
+    <w:bookmarkStart w:id="156" w:name="ref-kopka"/>
     <w:p>
       <w:pPr>
         <w:pStyle w:val="Bibliography"/>
@@ -9108,12 +9259,12 @@
         <w:t xml:space="preserve">LaTeX</w:t>
       </w:r>
       <w:r>
-        <w:t xml:space="preserve">. Fourth edition. Boston, Massachusetts: Addison-Wesley.</w:t>
-      </w:r>
-      <w:r>
-        <w:t xml:space="preserve"> </w:t>
-      </w:r>
-      <w:hyperlink r:id="rId166">
+        <w:t xml:space="preserve">. Fourth edition. Addison-Wesley.</w:t>
+      </w:r>
+      <w:r>
+        <w:t xml:space="preserve"> </w:t>
+      </w:r>
+      <w:hyperlink r:id="rId155">
         <w:r>
           <w:rPr>
             <w:rStyle w:val="Hyperlink"/>
@@ -9125,8 +9276,8 @@
         <w:t xml:space="preserve">.</w:t>
       </w:r>
     </w:p>
-    <w:bookmarkEnd w:id="167"/>
-    <w:bookmarkStart w:id="169" w:name="ref-yoda"/>
+    <w:bookmarkEnd w:id="156"/>
+    <w:bookmarkStart w:id="158" w:name="ref-yoda"/>
     <w:p>
       <w:pPr>
         <w:pStyle w:val="Bibliography"/>
@@ -9165,7 +9316,7 @@
       <w:r>
         <w:t xml:space="preserve"> </w:t>
       </w:r>
-      <w:hyperlink r:id="rId168">
+      <w:hyperlink r:id="rId157">
         <w:r>
           <w:rPr>
             <w:rStyle w:val="Hyperlink"/>
@@ -9177,8 +9328,8 @@
         <w:t xml:space="preserve">.</w:t>
       </w:r>
     </w:p>
-    <w:bookmarkEnd w:id="169"/>
-    <w:bookmarkStart w:id="171" w:name="ref-latexproject"/>
+    <w:bookmarkEnd w:id="158"/>
+    <w:bookmarkStart w:id="160" w:name="ref-latexproject"/>
     <w:p>
       <w:pPr>
         <w:pStyle w:val="Bibliography"/>
@@ -9190,27 +9341,33 @@
         <w:t xml:space="preserve"> </w:t>
       </w:r>
       <w:r>
-        <w:t xml:space="preserve">“</w:t>
-      </w:r>
-      <w:r>
+        <w:rPr>
+          <w:i/>
+          <w:iCs/>
+        </w:rPr>
         <w:t xml:space="preserve">LaTeX</w:t>
       </w:r>
       <w:r>
-        <w:t xml:space="preserve"> </w:t>
-      </w:r>
-      <w:r>
-        <w:t xml:space="preserve">– a Document Preparation System.”</w:t>
-      </w:r>
-      <w:r>
-        <w:t xml:space="preserve"> </w:t>
-      </w:r>
-      <w:r>
-        <w:t xml:space="preserve">latex-project.org.</w:t>
-      </w:r>
-      <w:r>
-        <w:t xml:space="preserve"> </w:t>
-      </w:r>
-      <w:hyperlink r:id="rId170">
+        <w:rPr>
+          <w:i/>
+          <w:iCs/>
+        </w:rPr>
+        <w:t xml:space="preserve"> </w:t>
+      </w:r>
+      <w:r>
+        <w:rPr>
+          <w:i/>
+          <w:iCs/>
+        </w:rPr>
+        <w:t xml:space="preserve">– a Document Preparation System</w:t>
+      </w:r>
+      <w:r>
+        <w:t xml:space="preserve">. Latex-project.org.</w:t>
+      </w:r>
+      <w:r>
+        <w:t xml:space="preserve"> </w:t>
+      </w:r>
+      <w:hyperlink r:id="rId159">
         <w:r>
           <w:rPr>
             <w:rStyle w:val="Hyperlink"/>
@@ -9222,8 +9379,8 @@
         <w:t xml:space="preserve">.</w:t>
       </w:r>
     </w:p>
-    <w:bookmarkEnd w:id="171"/>
-    <w:bookmarkStart w:id="173" w:name="ref-turing"/>
+    <w:bookmarkEnd w:id="160"/>
+    <w:bookmarkStart w:id="162" w:name="ref-turing"/>
     <w:p>
       <w:pPr>
         <w:pStyle w:val="Bibliography"/>
@@ -9256,7 +9413,7 @@
       <w:r>
         <w:t xml:space="preserve"> </w:t>
       </w:r>
-      <w:hyperlink r:id="rId172">
+      <w:hyperlink r:id="rId161">
         <w:r>
           <w:rPr>
             <w:rStyle w:val="Hyperlink"/>
@@ -9268,14 +9425,14 @@
         <w:t xml:space="preserve">.</w:t>
       </w:r>
     </w:p>
-    <w:bookmarkEnd w:id="173"/>
-    <w:bookmarkStart w:id="175" w:name="ref-turing50"/>
+    <w:bookmarkEnd w:id="162"/>
+    <w:bookmarkStart w:id="164" w:name="ref-turing50"/>
     <w:p>
       <w:pPr>
         <w:pStyle w:val="Bibliography"/>
       </w:pPr>
       <w:r>
-        <w:t xml:space="preserve">———. 1950.</w:t>
+        <w:t xml:space="preserve">Turing, Alan. 1950.</w:t>
       </w:r>
       <w:r>
         <w:t xml:space="preserve"> </w:t>
@@ -9321,6 +9478,12 @@
         <w:t xml:space="preserve"> </w:t>
       </w:r>
       <w:r>
+        <w:t xml:space="preserve">(Oxford)</w:t>
+      </w:r>
+      <w:r>
+        <w:t xml:space="preserve"> </w:t>
+      </w:r>
+      <w:r>
         <w:t xml:space="preserve">LIX</w:t>
       </w:r>
       <w:r>
@@ -9332,7 +9495,7 @@
       <w:r>
         <w:t xml:space="preserve"> </w:t>
       </w:r>
-      <w:hyperlink r:id="rId174">
+      <w:hyperlink r:id="rId163">
         <w:r>
           <w:rPr>
             <w:rStyle w:val="Hyperlink"/>
@@ -9344,9 +9507,9 @@
         <w:t xml:space="preserve">.</w:t>
       </w:r>
     </w:p>
-    <w:bookmarkEnd w:id="175"/>
-    <w:bookmarkEnd w:id="176"/>
-    <w:bookmarkEnd w:id="177"/>
+    <w:bookmarkEnd w:id="164"/>
+    <w:bookmarkEnd w:id="165"/>
+    <w:bookmarkEnd w:id="166"/>
     <w:sectPr>
       <w:footnotePr>
         <w:numRestart w:val="eachSect"/>
@@ -9376,7 +9539,7 @@
       </w:r>
     </w:p>
   </w:footnote>
-  <w:footnote w:id="55">
+  <w:footnote w:id="44">
     <w:p>
       <w:pPr>
         <w:pStyle w:val="FootnoteText"/>
@@ -9396,7 +9559,7 @@
       <w:r>
         <w:t xml:space="preserve"> </w:t>
       </w:r>
-      <w:hyperlink r:id="rId56">
+      <w:hyperlink r:id="rId45">
         <w:r>
           <w:rPr>
             <w:rStyle w:val="Hyperlink"/>
@@ -9410,7 +9573,7 @@
       <w:r>
         <w:t xml:space="preserve"> </w:t>
       </w:r>
-      <w:hyperlink r:id="rId57">
+      <w:hyperlink r:id="rId46">
         <w:r>
           <w:rPr>
             <w:rStyle w:val="Hyperlink"/>
@@ -9427,7 +9590,7 @@
       <w:r>
         <w:t xml:space="preserve"> </w:t>
       </w:r>
-      <w:hyperlink r:id="rId58">
+      <w:hyperlink r:id="rId47">
         <w:r>
           <w:rPr>
             <w:rStyle w:val="Hyperlink"/>
@@ -9443,7 +9606,7 @@
       </w:r>
     </w:p>
   </w:footnote>
-  <w:footnote w:id="59">
+  <w:footnote w:id="48">
     <w:p>
       <w:pPr>
         <w:pStyle w:val="FootnoteText"/>
@@ -9457,7 +9620,7 @@
       <w:r>
         <w:t xml:space="preserve"> </w:t>
       </w:r>
-      <w:hyperlink r:id="rId60">
+      <w:hyperlink r:id="rId49">
         <w:r>
           <w:rPr>
             <w:rStyle w:val="Hyperlink"/>
@@ -9467,7 +9630,7 @@
       </w:hyperlink>
     </w:p>
   </w:footnote>
-  <w:footnote w:id="61">
+  <w:footnote w:id="58">
     <w:p>
       <w:pPr>
         <w:pStyle w:val="FootnoteText"/>
@@ -9482,22 +9645,11 @@
         <w:t xml:space="preserve"> </w:t>
       </w:r>
       <w:r>
-        <w:t xml:space="preserve">for example the Linux VM image for VirtualBox</w:t>
-      </w:r>
-      <w:r>
-        <w:t xml:space="preserve"> </w:t>
-      </w:r>
-      <w:hyperlink r:id="rId62">
-        <w:r>
-          <w:rPr>
-            <w:rStyle w:val="Hyperlink"/>
-          </w:rPr>
-          <w:t xml:space="preserve">https://wiki.cs.manchester.ac.uk/index.php/CSImage_VM</w:t>
-        </w:r>
-      </w:hyperlink>
+        <w:t xml:space="preserve">Microsoft Word, Google Docs etc</w:t>
+      </w:r>
     </w:p>
   </w:footnote>
-  <w:footnote w:id="71">
+  <w:footnote w:id="78">
     <w:p>
       <w:pPr>
         <w:pStyle w:val="FootnoteText"/>
@@ -9512,11 +9664,11 @@
         <w:t xml:space="preserve"> </w:t>
       </w:r>
       <w:r>
-        <w:t xml:space="preserve">Microsoft Word, Google Docs etc</w:t>
+        <w:t xml:space="preserve">This is a footnote about footnotes. Very meta.</w:t>
       </w:r>
     </w:p>
   </w:footnote>
-  <w:footnote w:id="91">
+  <w:footnote w:id="79">
     <w:p>
       <w:pPr>
         <w:pStyle w:val="FootnoteText"/>
@@ -9531,31 +9683,12 @@
         <w:t xml:space="preserve"> </w:t>
       </w:r>
       <w:r>
-        <w:t xml:space="preserve">This is a footnote about footnotes. Very meta.</w:t>
-      </w:r>
-    </w:p>
-  </w:footnote>
-  <w:footnote w:id="92">
-    <w:p>
-      <w:pPr>
-        <w:pStyle w:val="FootnoteText"/>
-      </w:pPr>
-      <w:r>
-        <w:rPr>
-          <w:rStyle w:val="FootnoteReference"/>
-        </w:rPr>
-        <w:footnoteRef/>
-      </w:r>
-      <w:r>
-        <w:t xml:space="preserve"> </w:t>
-      </w:r>
-      <w:r>
         <w:t xml:space="preserve">BibTeX entries for journal articles can be automatically generated from persistent identifiers known as</w:t>
       </w:r>
       <w:r>
         <w:t xml:space="preserve"> </w:t>
       </w:r>
-      <w:hyperlink r:id="rId93">
+      <w:hyperlink r:id="rId80">
         <w:r>
           <w:rPr>
             <w:rStyle w:val="Hyperlink"/>
@@ -9572,7 +9705,7 @@
       <w:r>
         <w:t xml:space="preserve"> </w:t>
       </w:r>
-      <w:hyperlink r:id="rId94">
+      <w:hyperlink r:id="rId81">
         <w:r>
           <w:rPr>
             <w:rStyle w:val="Hyperlink"/>
@@ -9588,7 +9721,7 @@
       </w:r>
     </w:p>
   </w:footnote>
-  <w:footnote w:id="95">
+  <w:footnote w:id="82">
     <w:p>
       <w:pPr>
         <w:pStyle w:val="FootnoteText"/>
@@ -9608,7 +9741,7 @@
       <w:r>
         <w:t xml:space="preserve"> </w:t>
       </w:r>
-      <w:hyperlink r:id="rId96">
+      <w:hyperlink r:id="rId83">
         <w:r>
           <w:rPr>
             <w:rStyle w:val="Hyperlink"/>
@@ -9618,7 +9751,7 @@
       </w:hyperlink>
     </w:p>
   </w:footnote>
-  <w:footnote w:id="116">
+  <w:footnote w:id="103">
     <w:p>
       <w:pPr>
         <w:pStyle w:val="FootnoteText"/>
@@ -9638,7 +9771,7 @@
       <w:r>
         <w:t xml:space="preserve"> </w:t>
       </w:r>
-      <w:hyperlink r:id="rId117">
+      <w:hyperlink r:id="rId104">
         <w:r>
           <w:rPr>
             <w:rStyle w:val="Hyperlink"/>
@@ -9655,7 +9788,7 @@
       <w:r>
         <w:t xml:space="preserve"> </w:t>
       </w:r>
-      <w:hyperlink r:id="rId118">
+      <w:hyperlink r:id="rId105">
         <w:r>
           <w:rPr>
             <w:rStyle w:val="Hyperlink"/>
@@ -9671,7 +9804,7 @@
       </w:r>
     </w:p>
   </w:footnote>
-  <w:footnote w:id="119">
+  <w:footnote w:id="106">
     <w:p>
       <w:pPr>
         <w:pStyle w:val="FootnoteText"/>
@@ -9685,7 +9818,7 @@
       <w:r>
         <w:t xml:space="preserve"> </w:t>
       </w:r>
-      <w:hyperlink r:id="rId120">
+      <w:hyperlink r:id="rId107">
         <w:r>
           <w:rPr>
             <w:rStyle w:val="Hyperlink"/>
@@ -9695,7 +9828,7 @@
       </w:hyperlink>
     </w:p>
   </w:footnote>
-  <w:footnote w:id="126">
+  <w:footnote w:id="113">
     <w:p>
       <w:pPr>
         <w:pStyle w:val="FootnoteText"/>
@@ -10120,10 +10253,10 @@
   <w:docDefaults>
     <w:rPrDefault>
       <w:rPr>
-        <w:rFonts w:asciiTheme="minorHAnsi" w:cstheme="minorBidi" w:eastAsiaTheme="minorHAnsi" w:hAnsiTheme="minorHAnsi"/>
+        <w:rFonts w:asciiTheme="minorHAnsi" w:cstheme="minorBidi" w:eastAsiaTheme="minorEastAsia" w:hAnsiTheme="minorHAnsi"/>
         <w:sz w:val="24"/>
         <w:szCs w:val="24"/>
-        <w:lang w:bidi="ar-SA" w:eastAsia="en-US" w:val="en-US"/>
+        <w:lang w:bidi="ar-SA" w:eastAsia="zh-CN" w:val="en-US"/>
       </w:rPr>
     </w:rPrDefault>
     <w:pPrDefault>
@@ -10664,13 +10797,6 @@
       </w:tblCellMar>
     </w:tblPr>
     <w:tblStylePr w:type="firstRow">
-      <w:tblPr>
-        <w:jc w:val="left"/>
-        <w:tblInd w:type="dxa" w:w="0"/>
-      </w:tblPr>
-      <w:trPr>
-        <w:jc w:val="left"/>
-      </w:trPr>
       <w:tcPr>
         <w:tcBorders>
           <w:bottom w:val="single"/>

</xml_diff>

<commit_message>
remove references to blackboard
</commit_message>
<xml_diff>
--- a/_book/latex4year1.docx
+++ b/_book/latex4year1.docx
@@ -26,7 +26,7 @@
         <w:t xml:space="preserve">Last updated on 22 September, 2026</w:t>
       </w:r>
     </w:p>
-    <w:bookmarkStart w:id="27" w:name="welcome"/>
+    <w:bookmarkStart w:id="28" w:name="welcome"/>
     <w:p>
       <w:pPr>
         <w:pStyle w:val="Heading1"/>
@@ -196,7 +196,7 @@
         <w:t xml:space="preserve">Draft a CV using LaTeX templates</w:t>
       </w:r>
     </w:p>
-    <w:bookmarkStart w:id="20" w:name="acknowledgements"/>
+    <w:bookmarkStart w:id="21" w:name="acknowledgements"/>
     <w:p>
       <w:pPr>
         <w:pStyle w:val="Heading2"/>
@@ -210,12 +210,29 @@
         <w:pStyle w:val="FirstParagraph"/>
       </w:pPr>
       <w:r>
-        <w:t xml:space="preserve">This manual is a substantially revised version of earlier LaTeX lab manuals created by</w:t>
+        <w:t xml:space="preserve">This manual has been edited by</w:t>
       </w:r>
       <w:r>
         <w:t xml:space="preserve"> </w:t>
       </w:r>
       <w:hyperlink r:id="rId15">
+        <w:r>
+          <w:rPr>
+            <w:rStyle w:val="Hyperlink"/>
+          </w:rPr>
+          <w:t xml:space="preserve">Duncan Hull</w:t>
+        </w:r>
+      </w:hyperlink>
+      <w:r>
+        <w:t xml:space="preserve"> </w:t>
+      </w:r>
+      <w:r>
+        <w:t xml:space="preserve">based on previous LaTeX lab manuals created by</w:t>
+      </w:r>
+      <w:r>
+        <w:t xml:space="preserve"> </w:t>
+      </w:r>
+      <w:hyperlink r:id="rId16">
         <w:r>
           <w:rPr>
             <w:rStyle w:val="Hyperlink"/>
@@ -229,7 +246,7 @@
       <w:r>
         <w:t xml:space="preserve"> </w:t>
       </w:r>
-      <w:hyperlink r:id="rId16">
+      <w:hyperlink r:id="rId17">
         <w:r>
           <w:rPr>
             <w:rStyle w:val="Hyperlink"/>
@@ -243,7 +260,7 @@
       <w:r>
         <w:t xml:space="preserve"> </w:t>
       </w:r>
-      <w:hyperlink r:id="rId17">
+      <w:hyperlink r:id="rId18">
         <w:r>
           <w:rPr>
             <w:rStyle w:val="Hyperlink"/>
@@ -257,7 +274,7 @@
       <w:r>
         <w:t xml:space="preserve"> </w:t>
       </w:r>
-      <w:hyperlink r:id="rId18">
+      <w:hyperlink r:id="rId19">
         <w:r>
           <w:rPr>
             <w:rStyle w:val="Hyperlink"/>
@@ -274,7 +291,7 @@
       <w:r>
         <w:t xml:space="preserve"> </w:t>
       </w:r>
-      <w:hyperlink r:id="rId19">
+      <w:hyperlink r:id="rId20">
         <w:r>
           <w:rPr>
             <w:rStyle w:val="Hyperlink"/>
@@ -286,8 +303,8 @@
         <w:t xml:space="preserve">.</w:t>
       </w:r>
     </w:p>
-    <w:bookmarkEnd w:id="20"/>
-    <w:bookmarkStart w:id="26" w:name="improve-this-manual"/>
+    <w:bookmarkEnd w:id="21"/>
+    <w:bookmarkStart w:id="27" w:name="improve-this-manual"/>
     <w:p>
       <w:pPr>
         <w:pStyle w:val="Heading2"/>
@@ -306,7 +323,7 @@
       <w:r>
         <w:t xml:space="preserve"> </w:t>
       </w:r>
-      <w:hyperlink r:id="rId21">
+      <w:hyperlink r:id="rId22">
         <w:r>
           <w:rPr>
             <w:rStyle w:val="Hyperlink"/>
@@ -323,7 +340,7 @@
       <w:r>
         <w:t xml:space="preserve"> </w:t>
       </w:r>
-      <w:hyperlink r:id="rId22">
+      <w:hyperlink r:id="rId23">
         <w:r>
           <w:rPr>
             <w:rStyle w:val="Hyperlink"/>
@@ -342,7 +359,7 @@
       <w:r>
         <w:t xml:space="preserve">Thanks to contributions from Hamza Latif (</w:t>
       </w:r>
-      <w:hyperlink r:id="rId23">
+      <w:hyperlink r:id="rId24">
         <w:r>
           <w:rPr>
             <w:rStyle w:val="Hyperlink"/>
@@ -353,7 +370,7 @@
       <w:r>
         <w:t xml:space="preserve">) and Saurav Maheshkar (</w:t>
       </w:r>
-      <w:hyperlink r:id="rId24">
+      <w:hyperlink r:id="rId25">
         <w:r>
           <w:rPr>
             <w:rStyle w:val="Hyperlink"/>
@@ -391,7 +408,7 @@
       <w:r>
         <w:t xml:space="preserve"> </w:t>
       </w:r>
-      <w:hyperlink r:id="rId25">
+      <w:hyperlink r:id="rId26">
         <w:r>
           <w:rPr>
             <w:rStyle w:val="Hyperlink"/>
@@ -406,9 +423,9 @@
         <w:t xml:space="preserve">directly.</w:t>
       </w:r>
     </w:p>
-    <w:bookmarkEnd w:id="26"/>
     <w:bookmarkEnd w:id="27"/>
-    <w:bookmarkStart w:id="43" w:name="latex"/>
+    <w:bookmarkEnd w:id="28"/>
+    <w:bookmarkStart w:id="44" w:name="latex"/>
     <w:p>
       <w:pPr>
         <w:pStyle w:val="Heading1"/>
@@ -482,7 +499,7 @@
       <w:r>
         <w:t xml:space="preserve"> </w:t>
       </w:r>
-      <w:hyperlink r:id="rId28">
+      <w:hyperlink r:id="rId29">
         <w:r>
           <w:rPr>
             <w:rStyle w:val="Hyperlink"/>
@@ -502,7 +519,7 @@
       <w:r>
         <w:t xml:space="preserve"> </w:t>
       </w:r>
-      <w:hyperlink r:id="rId29">
+      <w:hyperlink r:id="rId30">
         <w:r>
           <w:rPr>
             <w:rStyle w:val="Hyperlink"/>
@@ -519,7 +536,7 @@
       <w:r>
         <w:t xml:space="preserve"> </w:t>
       </w:r>
-      <w:hyperlink r:id="rId30">
+      <w:hyperlink r:id="rId31">
         <w:r>
           <w:rPr>
             <w:rStyle w:val="Hyperlink"/>
@@ -533,7 +550,7 @@
       <w:r>
         <w:t xml:space="preserve"> </w:t>
       </w:r>
-      <w:hyperlink r:id="rId31">
+      <w:hyperlink r:id="rId32">
         <w:r>
           <w:rPr>
             <w:rStyle w:val="Hyperlink"/>
@@ -566,18 +583,18 @@
           <wp:inline>
             <wp:extent cx="2506980" cy="2961143"/>
             <wp:effectExtent b="0" l="0" r="0" t="0"/>
-            <wp:docPr descr="Figure 1.1: Turing award winners Leslie Lamport and Donald Knuth created TeX and LaTeX during the 1980’s. Lamport portrait by Leslie Lamport, GFDL via Wikimedia Commons w.wiki/3Daz, Knuth portrait by Jacob Appelbaum CC BY-SA via Wikimedia Commons w.wiki/3Day. Is Donald Knuth the The Yoda of Silicon Valley? (Roberts 2018)" title="" id="33" name="Picture"/>
+            <wp:docPr descr="Figure 1.1: Turing award winners Leslie Lamport and Donald Knuth created TeX and LaTeX during the 1980’s. Lamport portrait by Leslie Lamport, GFDL via Wikimedia Commons w.wiki/3Daz, Knuth portrait by Jacob Appelbaum CC BY-SA via Wikimedia Commons w.wiki/3Day. Is Donald Knuth the The Yoda of Silicon Valley? (Roberts 2018)" title="" id="34" name="Picture"/>
             <a:graphic>
               <a:graphicData uri="http://schemas.openxmlformats.org/drawingml/2006/picture">
                 <pic:pic>
                   <pic:nvPicPr>
-                    <pic:cNvPr descr="images/Leslie_Lamport.jpg" id="34" name="Picture"/>
+                    <pic:cNvPr descr="images/Leslie_Lamport.jpg" id="35" name="Picture"/>
                     <pic:cNvPicPr>
                       <a:picLocks noChangeArrowheads="1" noChangeAspect="1"/>
                     </pic:cNvPicPr>
                   </pic:nvPicPr>
                   <pic:blipFill>
-                    <a:blip r:embed="rId32"/>
+                    <a:blip r:embed="rId33"/>
                     <a:stretch>
                       <a:fillRect/>
                     </a:stretch>
@@ -608,18 +625,18 @@
           <wp:inline>
             <wp:extent cx="2506980" cy="2964929"/>
             <wp:effectExtent b="0" l="0" r="0" t="0"/>
-            <wp:docPr descr="(#fig:knuthport-fig)Turing award winners Leslie Lamport and Donald Knuth created TeX and LaTeX during the 1980’s. Lamport portrait by Leslie Lamport, GFDL via Wikimedia Commons w.wiki/3Daz, Knuth portrait by Jacob Appelbaum CC BY-SA via Wikimedia Commons w.wiki/3Day. Is Donald Knuth the The Yoda of Silicon Valley? (Roberts 2018)" title="" id="36" name="Picture"/>
+            <wp:docPr descr="(#fig:knuthport-fig)Turing award winners Leslie Lamport and Donald Knuth created TeX and LaTeX during the 1980’s. Lamport portrait by Leslie Lamport, GFDL via Wikimedia Commons w.wiki/3Daz, Knuth portrait by Jacob Appelbaum CC BY-SA via Wikimedia Commons w.wiki/3Day. Is Donald Knuth the The Yoda of Silicon Valley? (Roberts 2018)" title="" id="37" name="Picture"/>
             <a:graphic>
               <a:graphicData uri="http://schemas.openxmlformats.org/drawingml/2006/picture">
                 <pic:pic>
                   <pic:nvPicPr>
-                    <pic:cNvPr descr="images/KnuthAtOpenContentAlliance.jpg" id="37" name="Picture"/>
+                    <pic:cNvPr descr="images/KnuthAtOpenContentAlliance.jpg" id="38" name="Picture"/>
                     <pic:cNvPicPr>
                       <a:picLocks noChangeArrowheads="1" noChangeAspect="1"/>
                     </pic:cNvPicPr>
                   </pic:nvPicPr>
                   <pic:blipFill>
-                    <a:blip r:embed="rId35"/>
+                    <a:blip r:embed="rId36"/>
                     <a:stretch>
                       <a:fillRect/>
                     </a:stretch>
@@ -654,7 +671,7 @@
         <w:t xml:space="preserve">LaTeX is typically used for technical documents but it can be used for almost any form of publishing, including writing CVs, letters, books, posters, presentations and much more. Whatever you create with LaTeX, one of its key strengths is making documents look professional in portable document format (pdf) using industrial-strength typesetting.</w:t>
       </w:r>
     </w:p>
-    <w:bookmarkStart w:id="40" w:name="notword"/>
+    <w:bookmarkStart w:id="41" w:name="notword"/>
     <w:p>
       <w:pPr>
         <w:pStyle w:val="Heading2"/>
@@ -738,7 +755,7 @@
       <w:r>
         <w:t xml:space="preserve"> </w:t>
       </w:r>
-      <w:hyperlink r:id="rId38">
+      <w:hyperlink r:id="rId39">
         <w:r>
           <w:rPr>
             <w:rStyle w:val="Hyperlink"/>
@@ -791,7 +808,7 @@
       <w:r>
         <w:t xml:space="preserve">a what you see is what you get (</w:t>
       </w:r>
-      <w:hyperlink r:id="rId39">
+      <w:hyperlink r:id="rId40">
         <w:r>
           <w:rPr>
             <w:rStyle w:val="Hyperlink"/>
@@ -833,8 +850,8 @@
         <w:t xml:space="preserve">file output). LaTeX doesn’t even come with a spell-checker, though there are many plug-ins you can use for that, they are not built in.</w:t>
       </w:r>
     </w:p>
-    <w:bookmarkEnd w:id="40"/>
-    <w:bookmarkStart w:id="42" w:name="so-what-is-latex-then"/>
+    <w:bookmarkEnd w:id="41"/>
+    <w:bookmarkStart w:id="43" w:name="so-what-is-latex-then"/>
     <w:p>
       <w:pPr>
         <w:pStyle w:val="Heading2"/>
@@ -862,7 +879,7 @@
       <w:r>
         <w:t xml:space="preserve"> </w:t>
       </w:r>
-      <w:hyperlink r:id="rId41">
+      <w:hyperlink r:id="rId42">
         <w:r>
           <w:rPr>
             <w:rStyle w:val="Hyperlink"/>
@@ -885,9 +902,9 @@
         <w:t xml:space="preserve">The best way to understand LaTeX is to create some simple documents which we’ll do in the next chapter.</w:t>
       </w:r>
     </w:p>
-    <w:bookmarkEnd w:id="42"/>
     <w:bookmarkEnd w:id="43"/>
-    <w:bookmarkStart w:id="61" w:name="simples"/>
+    <w:bookmarkEnd w:id="44"/>
+    <w:bookmarkStart w:id="62" w:name="simples"/>
     <w:p>
       <w:pPr>
         <w:pStyle w:val="Heading1"/>
@@ -913,7 +930,7 @@
         <w:t xml:space="preserve">Let’s start by creating a simple LaTeX document.</w:t>
       </w:r>
     </w:p>
-    <w:bookmarkStart w:id="51" w:name="shortest"/>
+    <w:bookmarkStart w:id="52" w:name="shortest"/>
     <w:p>
       <w:pPr>
         <w:pStyle w:val="Heading2"/>
@@ -942,7 +959,7 @@
         <w:rPr>
           <w:rStyle w:val="FootnoteReference"/>
         </w:rPr>
-        <w:footnoteReference w:id="44"/>
+        <w:footnoteReference w:id="45"/>
       </w:r>
       <w:r>
         <w:t xml:space="preserve">, enter the following text, then save it as a file called</w:t>
@@ -1075,7 +1092,7 @@
         <w:rPr>
           <w:rStyle w:val="FootnoteReference"/>
         </w:rPr>
-        <w:footnoteReference w:id="48"/>
+        <w:footnoteReference w:id="49"/>
       </w:r>
       <w:r>
         <w:t xml:space="preserve"> </w:t>
@@ -1101,7 +1118,7 @@
       <w:r>
         <w:t xml:space="preserve"> </w:t>
       </w:r>
-      <w:hyperlink r:id="rId50">
+      <w:hyperlink r:id="rId51">
         <w:r>
           <w:rPr>
             <w:rStyle w:val="Hyperlink"/>
@@ -1287,8 +1304,8 @@
         <w:t xml:space="preserve">turing.log</w:t>
       </w:r>
     </w:p>
-    <w:bookmarkEnd w:id="51"/>
-    <w:bookmarkStart w:id="53" w:name="longer"/>
+    <w:bookmarkEnd w:id="52"/>
+    <w:bookmarkStart w:id="54" w:name="longer"/>
     <w:p>
       <w:pPr>
         <w:pStyle w:val="Heading2"/>
@@ -1797,7 +1814,7 @@
       <w:r>
         <w:t xml:space="preserve"> </w:t>
       </w:r>
-      <w:hyperlink r:id="rId52">
+      <w:hyperlink r:id="rId53">
         <w:r>
           <w:rPr>
             <w:rStyle w:val="Hyperlink"/>
@@ -1829,8 +1846,8 @@
         <w:t xml:space="preserve">)</w:t>
       </w:r>
     </w:p>
-    <w:bookmarkEnd w:id="53"/>
-    <w:bookmarkStart w:id="56" w:name="ex1"/>
+    <w:bookmarkEnd w:id="54"/>
+    <w:bookmarkStart w:id="57" w:name="ex1"/>
     <w:p>
       <w:pPr>
         <w:pStyle w:val="Heading2"/>
@@ -1873,7 +1890,7 @@
       <w:r>
         <w:t xml:space="preserve"> </w:t>
       </w:r>
-      <w:hyperlink r:id="rId54">
+      <w:hyperlink r:id="rId55">
         <w:r>
           <w:rPr>
             <w:rStyle w:val="Hyperlink"/>
@@ -1890,7 +1907,7 @@
       <w:r>
         <w:t xml:space="preserve"> </w:t>
       </w:r>
-      <w:hyperlink r:id="rId55">
+      <w:hyperlink r:id="rId56">
         <w:r>
           <w:rPr>
             <w:rStyle w:val="Hyperlink"/>
@@ -2121,8 +2138,8 @@
         <w:t xml:space="preserve">pdflatex turing.tex</w:t>
       </w:r>
     </w:p>
-    <w:bookmarkEnd w:id="56"/>
-    <w:bookmarkStart w:id="57" w:name="bold-italic-and-lists"/>
+    <w:bookmarkEnd w:id="57"/>
+    <w:bookmarkStart w:id="58" w:name="bold-italic-and-lists"/>
     <w:p>
       <w:pPr>
         <w:pStyle w:val="Heading2"/>
@@ -2270,8 +2287,8 @@
         <w:t xml:space="preserve">for bulleted lists.</w:t>
       </w:r>
     </w:p>
-    <w:bookmarkEnd w:id="57"/>
-    <w:bookmarkStart w:id="59" w:name="quotation-marks"/>
+    <w:bookmarkEnd w:id="58"/>
+    <w:bookmarkStart w:id="60" w:name="quotation-marks"/>
     <w:p>
       <w:pPr>
         <w:pStyle w:val="Heading2"/>
@@ -2502,7 +2519,7 @@
         <w:rPr>
           <w:rStyle w:val="FootnoteReference"/>
         </w:rPr>
-        <w:footnoteReference w:id="58"/>
+        <w:footnoteReference w:id="59"/>
       </w:r>
       <w:r>
         <w:t xml:space="preserve"> </w:t>
@@ -2523,8 +2540,8 @@
         <w:t xml:space="preserve"> </w:t>
       </w:r>
     </w:p>
-    <w:bookmarkEnd w:id="59"/>
-    <w:bookmarkStart w:id="60" w:name="concsimple"/>
+    <w:bookmarkEnd w:id="60"/>
+    <w:bookmarkStart w:id="61" w:name="concsimple"/>
     <w:p>
       <w:pPr>
         <w:pStyle w:val="Heading2"/>
@@ -2594,9 +2611,9 @@
         <w:t xml:space="preserve">Next we’ll look at adding some cross-references, figures and citations. This is one thing that LaTeX does much better than your average word processing software which makes it great for editing larger and longer documents, such as your Bachelors, Masters or PhD thesis.</w:t>
       </w:r>
     </w:p>
-    <w:bookmarkEnd w:id="60"/>
     <w:bookmarkEnd w:id="61"/>
-    <w:bookmarkStart w:id="86" w:name="figref"/>
+    <w:bookmarkEnd w:id="62"/>
+    <w:bookmarkStart w:id="87" w:name="figref"/>
     <w:p>
       <w:pPr>
         <w:pStyle w:val="Heading1"/>
@@ -2655,18 +2672,18 @@
           <wp:inline>
             <wp:extent cx="572215" cy="310140"/>
             <wp:effectExtent b="0" l="0" r="0" t="0"/>
-            <wp:docPr descr="Figure 3.1: It has always been important to cite your sources and LaTeX gives you the tools to cite properly. Wikipedian Protester cartoon by Randall Munroe at xkcd.com/285 published under a Creative Commons Attribution-NonCommercial 2.5 License" title="" id="63" name="Picture"/>
+            <wp:docPr descr="Figure 3.1: It has always been important to cite your sources and LaTeX gives you the tools to cite properly. Wikipedian Protester cartoon by Randall Munroe at xkcd.com/285 published under a Creative Commons Attribution-NonCommercial 2.5 License" title="" id="64" name="Picture"/>
             <a:graphic>
               <a:graphicData uri="http://schemas.openxmlformats.org/drawingml/2006/picture">
                 <pic:pic>
                   <pic:nvPicPr>
-                    <pic:cNvPr descr="images/wikipedian_protester.png" id="64" name="Picture"/>
+                    <pic:cNvPr descr="images/wikipedian_protester.png" id="65" name="Picture"/>
                     <pic:cNvPicPr>
                       <a:picLocks noChangeArrowheads="1" noChangeAspect="1"/>
                     </pic:cNvPicPr>
                   </pic:nvPicPr>
                   <pic:blipFill>
-                    <a:blip r:embed="rId62"/>
+                    <a:blip r:embed="rId63"/>
                     <a:stretch>
                       <a:fillRect/>
                     </a:stretch>
@@ -2697,8 +2714,8 @@
       <w:pPr>
         <w:pStyle w:val="ImageCaption"/>
       </w:pPr>
-      <w:bookmarkStart w:id="65" w:name="fig:wikipedian-fig"/>
-      <w:bookmarkEnd w:id="65"/>
+      <w:bookmarkStart w:id="66" w:name="fig:wikipedian-fig"/>
+      <w:bookmarkEnd w:id="66"/>
       <w:r>
         <w:t xml:space="preserve">Figure 3.1: It has always been important to cite your sources and LaTeX gives you the tools to cite properly.</w:t>
       </w:r>
@@ -2721,7 +2738,7 @@
       <w:r>
         <w:t xml:space="preserve"> </w:t>
       </w:r>
-      <w:hyperlink r:id="rId66">
+      <w:hyperlink r:id="rId67">
         <w:r>
           <w:rPr>
             <w:rStyle w:val="Hyperlink"/>
@@ -2738,7 +2755,7 @@
       <w:r>
         <w:t xml:space="preserve"> </w:t>
       </w:r>
-      <w:hyperlink r:id="rId67">
+      <w:hyperlink r:id="rId68">
         <w:r>
           <w:rPr>
             <w:rStyle w:val="Hyperlink"/>
@@ -2755,7 +2772,7 @@
       <w:r>
         <w:t xml:space="preserve"> </w:t>
       </w:r>
-      <w:hyperlink r:id="rId68">
+      <w:hyperlink r:id="rId69">
         <w:r>
           <w:rPr>
             <w:rStyle w:val="Hyperlink"/>
@@ -2764,7 +2781,7 @@
         </w:r>
       </w:hyperlink>
     </w:p>
-    <w:bookmarkStart w:id="69" w:name="cross-referencing"/>
+    <w:bookmarkStart w:id="70" w:name="cross-referencing"/>
     <w:p>
       <w:pPr>
         <w:pStyle w:val="Heading2"/>
@@ -3076,8 +3093,8 @@
         <w:t xml:space="preserve">}</w:t>
       </w:r>
     </w:p>
-    <w:bookmarkEnd w:id="69"/>
-    <w:bookmarkStart w:id="76" w:name="illustrating-your-documents"/>
+    <w:bookmarkEnd w:id="70"/>
+    <w:bookmarkStart w:id="77" w:name="illustrating-your-documents"/>
     <w:p>
       <w:pPr>
         <w:pStyle w:val="Heading2"/>
@@ -3121,18 +3138,18 @@
           <wp:inline>
             <wp:extent cx="2133600" cy="2904856"/>
             <wp:effectExtent b="0" l="0" r="0" t="0"/>
-            <wp:docPr descr="Figure 3.2: Alan Turing at the age of sixteen, portrait by unknown author, public domain, via Wikimedia Commons w.wiki/oZx" title="" id="71" name="Picture"/>
+            <wp:docPr descr="Figure 3.2: Alan Turing at the age of sixteen, portrait by unknown author, public domain, via Wikimedia Commons w.wiki/oZx" title="" id="72" name="Picture"/>
             <a:graphic>
               <a:graphicData uri="http://schemas.openxmlformats.org/drawingml/2006/picture">
                 <pic:pic>
                   <pic:nvPicPr>
-                    <pic:cNvPr descr="images/Alan_Turing_Aged_16.jpg" id="72" name="Picture"/>
+                    <pic:cNvPr descr="images/Alan_Turing_Aged_16.jpg" id="73" name="Picture"/>
                     <pic:cNvPicPr>
                       <a:picLocks noChangeArrowheads="1" noChangeAspect="1"/>
                     </pic:cNvPicPr>
                   </pic:nvPicPr>
                   <pic:blipFill>
-                    <a:blip r:embed="rId70"/>
+                    <a:blip r:embed="rId71"/>
                     <a:stretch>
                       <a:fillRect/>
                     </a:stretch>
@@ -3163,15 +3180,15 @@
       <w:pPr>
         <w:pStyle w:val="ImageCaption"/>
       </w:pPr>
-      <w:bookmarkStart w:id="73" w:name="fig:turing-fig"/>
-      <w:bookmarkEnd w:id="73"/>
+      <w:bookmarkStart w:id="74" w:name="fig:turing-fig"/>
+      <w:bookmarkEnd w:id="74"/>
       <w:r>
         <w:t xml:space="preserve">Figure 3.2:</w:t>
       </w:r>
       <w:r>
         <w:t xml:space="preserve"> </w:t>
       </w:r>
-      <w:hyperlink r:id="rId74">
+      <w:hyperlink r:id="rId75">
         <w:r>
           <w:rPr>
             <w:rStyle w:val="Hyperlink"/>
@@ -3188,7 +3205,7 @@
       <w:r>
         <w:t xml:space="preserve"> </w:t>
       </w:r>
-      <w:hyperlink r:id="rId75">
+      <w:hyperlink r:id="rId76">
         <w:r>
           <w:rPr>
             <w:rStyle w:val="Hyperlink"/>
@@ -3531,8 +3548,8 @@
         <w:t xml:space="preserve">}</w:t>
       </w:r>
     </w:p>
-    <w:bookmarkEnd w:id="76"/>
-    <w:bookmarkStart w:id="77" w:name="ex2"/>
+    <w:bookmarkEnd w:id="77"/>
+    <w:bookmarkStart w:id="78" w:name="ex2"/>
     <w:p>
       <w:pPr>
         <w:pStyle w:val="Heading2"/>
@@ -3570,8 +3587,8 @@
         <w:t xml:space="preserve">, that contains some text (maybe from Lorem Ipsum), together with a figure containing an image of your choice. Create a cross reference to the figure in the text.</w:t>
       </w:r>
     </w:p>
-    <w:bookmarkEnd w:id="77"/>
-    <w:bookmarkStart w:id="84" w:name="citations-and-footnotes"/>
+    <w:bookmarkEnd w:id="78"/>
+    <w:bookmarkStart w:id="85" w:name="citations-and-footnotes"/>
     <w:p>
       <w:pPr>
         <w:pStyle w:val="Heading2"/>
@@ -3600,7 +3617,7 @@
         <w:rPr>
           <w:rStyle w:val="FootnoteReference"/>
         </w:rPr>
-        <w:footnoteReference w:id="78"/>
+        <w:footnoteReference w:id="79"/>
       </w:r>
       <w:r>
         <w:t xml:space="preserve"> </w:t>
@@ -3831,7 +3848,7 @@
         <w:rPr>
           <w:rStyle w:val="FootnoteReference"/>
         </w:rPr>
-        <w:footnoteReference w:id="79"/>
+        <w:footnoteReference w:id="80"/>
       </w:r>
       <w:r>
         <w:t xml:space="preserve"> </w:t>
@@ -3976,7 +3993,7 @@
         <w:rPr>
           <w:rStyle w:val="FootnoteReference"/>
         </w:rPr>
-        <w:footnoteReference w:id="82"/>
+        <w:footnoteReference w:id="83"/>
       </w:r>
       <w:r>
         <w:t xml:space="preserve"> </w:t>
@@ -4529,8 +4546,8 @@
         <w:t xml:space="preserve">If you find all the typing at the command line tedious, you could write a little bash script to automate this simple workflow including opening the pdf when it is created.</w:t>
       </w:r>
     </w:p>
-    <w:bookmarkEnd w:id="84"/>
-    <w:bookmarkStart w:id="85" w:name="fingconc"/>
+    <w:bookmarkEnd w:id="85"/>
+    <w:bookmarkStart w:id="86" w:name="fingconc"/>
     <w:p>
       <w:pPr>
         <w:pStyle w:val="Heading2"/>
@@ -4556,9 +4573,9 @@
         <w:t xml:space="preserve">You have cross-referenced, illustrated, added citations and footnotes to your document. Next we’ll look at doing some maths.</w:t>
       </w:r>
     </w:p>
-    <w:bookmarkEnd w:id="85"/>
     <w:bookmarkEnd w:id="86"/>
-    <w:bookmarkStart w:id="94" w:name="maths"/>
+    <w:bookmarkEnd w:id="87"/>
+    <w:bookmarkStart w:id="95" w:name="maths"/>
     <w:p>
       <w:pPr>
         <w:pStyle w:val="Heading1"/>
@@ -4594,7 +4611,7 @@
       <w:r>
         <w:t xml:space="preserve"> </w:t>
       </w:r>
-      <w:hyperlink r:id="rId87">
+      <w:hyperlink r:id="rId88">
         <w:r>
           <w:rPr>
             <w:rStyle w:val="Hyperlink"/>
@@ -4611,7 +4628,7 @@
       <w:r>
         <w:t xml:space="preserve"> </w:t>
       </w:r>
-      <w:hyperlink r:id="rId88">
+      <w:hyperlink r:id="rId89">
         <w:r>
           <w:rPr>
             <w:rStyle w:val="Hyperlink"/>
@@ -4623,7 +4640,7 @@
         <w:t xml:space="preserve">. Otherwise, if you can see the equation below, it is safe to read on…</w:t>
       </w:r>
     </w:p>
-    <w:bookmarkStart w:id="89" w:name="equations"/>
+    <w:bookmarkStart w:id="90" w:name="equations"/>
     <w:p>
       <w:pPr>
         <w:pStyle w:val="Heading2"/>
@@ -5610,8 +5627,8 @@
         <w:t xml:space="preserve">, which is not at all what we want (even LaTeX can’t always know what we really want).</w:t>
       </w:r>
     </w:p>
-    <w:bookmarkEnd w:id="89"/>
-    <w:bookmarkStart w:id="91" w:name="matrix"/>
+    <w:bookmarkEnd w:id="90"/>
+    <w:bookmarkStart w:id="92" w:name="matrix"/>
     <w:p>
       <w:pPr>
         <w:pStyle w:val="Heading2"/>
@@ -6307,7 +6324,7 @@
       <w:r>
         <w:t xml:space="preserve"> </w:t>
       </w:r>
-      <w:hyperlink r:id="rId90">
+      <w:hyperlink r:id="rId91">
         <w:r>
           <w:rPr>
             <w:rStyle w:val="Hyperlink"/>
@@ -6355,8 +6372,8 @@
         <w:t xml:space="preserve">)</w:t>
       </w:r>
     </w:p>
-    <w:bookmarkEnd w:id="91"/>
-    <w:bookmarkStart w:id="92" w:name="ex3"/>
+    <w:bookmarkEnd w:id="92"/>
+    <w:bookmarkStart w:id="93" w:name="ex3"/>
     <w:p>
       <w:pPr>
         <w:pStyle w:val="Heading2"/>
@@ -6776,8 +6793,8 @@
         </m:oMath>
       </m:oMathPara>
     </w:p>
-    <w:bookmarkEnd w:id="92"/>
-    <w:bookmarkStart w:id="93" w:name="mathconc"/>
+    <w:bookmarkEnd w:id="93"/>
+    <w:bookmarkStart w:id="94" w:name="mathconc"/>
     <w:p>
       <w:pPr>
         <w:pStyle w:val="Heading2"/>
@@ -6803,9 +6820,9 @@
         <w:t xml:space="preserve">We’ve briefly introduced typesetting mathematics in LaTeX with some equations and a matrix. LaTeX can handle a lot more maths than that but this gives you a flavour of what it can do. In the next chapter we’ll look at collaborative authoring and editing in the cloud with overleaf.</w:t>
       </w:r>
     </w:p>
-    <w:bookmarkEnd w:id="93"/>
     <w:bookmarkEnd w:id="94"/>
-    <w:bookmarkStart w:id="112" w:name="overleaf"/>
+    <w:bookmarkEnd w:id="95"/>
+    <w:bookmarkStart w:id="113" w:name="overleaf"/>
     <w:p>
       <w:pPr>
         <w:pStyle w:val="Heading1"/>
@@ -6857,7 +6874,7 @@
       <w:r>
         <w:t xml:space="preserve">. Overleaf (</w:t>
       </w:r>
-      <w:hyperlink r:id="rId95">
+      <w:hyperlink r:id="rId96">
         <w:r>
           <w:rPr>
             <w:rStyle w:val="Hyperlink"/>
@@ -6887,18 +6904,18 @@
           <wp:inline>
             <wp:extent cx="5334000" cy="2647139"/>
             <wp:effectExtent b="0" l="0" r="0" t="0"/>
-            <wp:docPr descr="Figure 5.1: A screenshot of overleaf showing the source TeX on the left hand side and the corresponding pdf on the right hand side. Screenshot by Dan Cherniy via Wikimedia Commons at w.wiki/omo" title="" id="97" name="Picture"/>
+            <wp:docPr descr="Figure 5.1: A screenshot of overleaf showing the source TeX on the left hand side and the corresponding pdf on the right hand side. Screenshot by Dan Cherniy via Wikimedia Commons at w.wiki/omo" title="" id="98" name="Picture"/>
             <a:graphic>
               <a:graphicData uri="http://schemas.openxmlformats.org/drawingml/2006/picture">
                 <pic:pic>
                   <pic:nvPicPr>
-                    <pic:cNvPr descr="images/Overleaf_v2_editing_page.jpg" id="98" name="Picture"/>
+                    <pic:cNvPr descr="images/Overleaf_v2_editing_page.jpg" id="99" name="Picture"/>
                     <pic:cNvPicPr>
                       <a:picLocks noChangeArrowheads="1" noChangeAspect="1"/>
                     </pic:cNvPicPr>
                   </pic:nvPicPr>
                   <pic:blipFill>
-                    <a:blip r:embed="rId96"/>
+                    <a:blip r:embed="rId97"/>
                     <a:stretch>
                       <a:fillRect/>
                     </a:stretch>
@@ -6929,15 +6946,15 @@
       <w:pPr>
         <w:pStyle w:val="ImageCaption"/>
       </w:pPr>
-      <w:bookmarkStart w:id="99" w:name="fig:overleaf-fig"/>
-      <w:bookmarkEnd w:id="99"/>
+      <w:bookmarkStart w:id="100" w:name="fig:overleaf-fig"/>
+      <w:bookmarkEnd w:id="100"/>
       <w:r>
         <w:t xml:space="preserve">Figure 5.1: A screenshot of overleaf showing the source TeX on the left hand side and the corresponding pdf on the right hand side. Screenshot by Dan Cherniy via Wikimedia Commons at</w:t>
       </w:r>
       <w:r>
         <w:t xml:space="preserve"> </w:t>
       </w:r>
-      <w:hyperlink r:id="rId100">
+      <w:hyperlink r:id="rId101">
         <w:r>
           <w:rPr>
             <w:rStyle w:val="Hyperlink"/>
@@ -6956,7 +6973,7 @@
       <w:r>
         <w:t xml:space="preserve"> </w:t>
       </w:r>
-      <w:hyperlink r:id="rId101">
+      <w:hyperlink r:id="rId102">
         <w:r>
           <w:rPr>
             <w:rStyle w:val="Hyperlink"/>
@@ -6973,7 +6990,7 @@
       <w:r>
         <w:t xml:space="preserve"> </w:t>
       </w:r>
-      <w:hyperlink r:id="rId102">
+      <w:hyperlink r:id="rId103">
         <w:r>
           <w:rPr>
             <w:rStyle w:val="Hyperlink"/>
@@ -7024,7 +7041,7 @@
         <w:rPr>
           <w:rStyle w:val="FootnoteReference"/>
         </w:rPr>
-        <w:footnoteReference w:id="103"/>
+        <w:footnoteReference w:id="104"/>
       </w:r>
     </w:p>
     <w:p>
@@ -7039,7 +7056,7 @@
         <w:t xml:space="preserve">Overleaf publish lots of tutorials to help you learn LaTeX</w:t>
       </w:r>
     </w:p>
-    <w:bookmarkStart w:id="110" w:name="ex4"/>
+    <w:bookmarkStart w:id="111" w:name="ex4"/>
     <w:p>
       <w:pPr>
         <w:pStyle w:val="Heading2"/>
@@ -7067,7 +7084,7 @@
       <w:r>
         <w:t xml:space="preserve"> </w:t>
       </w:r>
-      <w:hyperlink r:id="rId95">
+      <w:hyperlink r:id="rId96">
         <w:r>
           <w:rPr>
             <w:rStyle w:val="Hyperlink"/>
@@ -7107,7 +7124,7 @@
         <w:rPr>
           <w:rStyle w:val="FootnoteReference"/>
         </w:rPr>
-        <w:footnoteReference w:id="106"/>
+        <w:footnoteReference w:id="107"/>
       </w:r>
       <w:r>
         <w:br/>
@@ -7139,7 +7156,7 @@
       <w:r>
         <w:t xml:space="preserve"> </w:t>
       </w:r>
-      <w:hyperlink r:id="rId108">
+      <w:hyperlink r:id="rId109">
         <w:r>
           <w:rPr>
             <w:rStyle w:val="Hyperlink"/>
@@ -7156,7 +7173,7 @@
       <w:r>
         <w:t xml:space="preserve"> </w:t>
       </w:r>
-      <w:hyperlink r:id="rId109">
+      <w:hyperlink r:id="rId110">
         <w:r>
           <w:rPr>
             <w:rStyle w:val="Hyperlink"/>
@@ -7171,8 +7188,8 @@
         <w:t xml:space="preserve">if you want to take things further</w:t>
       </w:r>
     </w:p>
-    <w:bookmarkEnd w:id="110"/>
-    <w:bookmarkStart w:id="111" w:name="overleafconc"/>
+    <w:bookmarkEnd w:id="111"/>
+    <w:bookmarkStart w:id="112" w:name="overleafconc"/>
     <w:p>
       <w:pPr>
         <w:pStyle w:val="Heading2"/>
@@ -7244,9 +7261,9 @@
         <w:t xml:space="preserve">Which interface is “best” for you will largely depend on what kind of documents you are writing and what your workflow is. In the next chapter we will create a curriculum vitae using CV templates provided by overleaf.</w:t>
       </w:r>
     </w:p>
-    <w:bookmarkEnd w:id="111"/>
     <w:bookmarkEnd w:id="112"/>
-    <w:bookmarkStart w:id="140" w:name="cv"/>
+    <w:bookmarkEnd w:id="113"/>
+    <w:bookmarkStart w:id="143" w:name="cv"/>
     <w:p>
       <w:pPr>
         <w:pStyle w:val="Heading1"/>
@@ -7291,7 +7308,7 @@
         <w:rPr>
           <w:rStyle w:val="FootnoteReference"/>
         </w:rPr>
-        <w:footnoteReference w:id="113"/>
+        <w:footnoteReference w:id="114"/>
       </w:r>
       <w:r>
         <w:t xml:space="preserve"> </w:t>
@@ -7318,18 +7335,18 @@
           <wp:inline>
             <wp:extent cx="5334000" cy="6339737"/>
             <wp:effectExtent b="0" l="0" r="0" t="0"/>
-            <wp:docPr descr="Figure 6.1: A fictitious example CV using an overleaf template. Would you invite Neil to interview based on his CV? This is what your CV needs to do, convince a decision maker they really need to contact you to find out more. This is just a screenshot, the pdf can be found at cdyf.me/Neil_Pointer.pdf. There are over 600 CV templates available to choose from at overleaf.com/gallery/tagged/cv" title="" id="115" name="Picture"/>
+            <wp:docPr descr="Figure 6.1: A fictitious example CV using an overleaf template. Would you invite Neil to interview based on his CV? This is what your CV needs to do, convince a decision maker they really need to contact you to find out more. This is just a screenshot, the pdf can be found at cdyf.me/Neil_Pointer.pdf. There are over 600 CV templates available to choose from at overleaf.com/gallery/tagged/cv" title="" id="116" name="Picture"/>
             <a:graphic>
               <a:graphicData uri="http://schemas.openxmlformats.org/drawingml/2006/picture">
                 <pic:pic>
                   <pic:nvPicPr>
-                    <pic:cNvPr descr="images/jake-ryan.png" id="116" name="Picture"/>
+                    <pic:cNvPr descr="images/jake-ryan.png" id="117" name="Picture"/>
                     <pic:cNvPicPr>
                       <a:picLocks noChangeArrowheads="1" noChangeAspect="1"/>
                     </pic:cNvPicPr>
                   </pic:nvPicPr>
                   <pic:blipFill>
-                    <a:blip r:embed="rId114"/>
+                    <a:blip r:embed="rId115"/>
                     <a:stretch>
                       <a:fillRect/>
                     </a:stretch>
@@ -7360,15 +7377,15 @@
       <w:pPr>
         <w:pStyle w:val="ImageCaption"/>
       </w:pPr>
-      <w:bookmarkStart w:id="117" w:name="fig:cv-fig"/>
-      <w:bookmarkEnd w:id="117"/>
+      <w:bookmarkStart w:id="118" w:name="fig:cv-fig"/>
+      <w:bookmarkEnd w:id="118"/>
       <w:r>
         <w:t xml:space="preserve">Figure 6.1: A fictitious example CV using an overleaf template. Would you invite Neil to interview based on his CV? This is what your CV needs to do, convince a decision maker they really need to contact you to find out more. This is just a screenshot, the pdf can be found at</w:t>
       </w:r>
       <w:r>
         <w:t xml:space="preserve"> </w:t>
       </w:r>
-      <w:hyperlink r:id="rId118">
+      <w:hyperlink r:id="rId119">
         <w:r>
           <w:rPr>
             <w:rStyle w:val="Hyperlink"/>
@@ -7382,7 +7399,7 @@
       <w:r>
         <w:t xml:space="preserve"> </w:t>
       </w:r>
-      <w:hyperlink r:id="rId119">
+      <w:hyperlink r:id="rId120">
         <w:r>
           <w:rPr>
             <w:rStyle w:val="Hyperlink"/>
@@ -7463,7 +7480,7 @@
         <w:t xml:space="preserve">the editing, what you’ve decided to leave in (and leave out) of your CV</w:t>
       </w:r>
     </w:p>
-    <w:bookmarkStart w:id="129" w:name="knocking"/>
+    <w:bookmarkStart w:id="131" w:name="knocking"/>
     <w:p>
       <w:pPr>
         <w:pStyle w:val="Heading2"/>
@@ -7505,7 +7522,7 @@
         <w:t xml:space="preserve">we mean both immediate ones within the next 12 months as well as those further in the future. To make the most of those opportunities, your CV needs to be persuasive enough to make an employer think they should invite you to interview.</w:t>
       </w:r>
     </w:p>
-    <w:bookmarkStart w:id="126" w:name="startearly"/>
+    <w:bookmarkStart w:id="128" w:name="startearly"/>
     <w:p>
       <w:pPr>
         <w:pStyle w:val="Heading3"/>
@@ -7556,7 +7573,7 @@
         </w:numPr>
       </w:pPr>
       <w:r>
-        <w:t xml:space="preserve">Spring insights, usually occur during easter vacation, and require you to apply before (or shortly after) Christmas, they very in length from hours to weeks see</w:t>
+        <w:t xml:space="preserve">Spring insights, usually occur during easter vacation, and require you to apply before (or shortly after) Christmas, they vary in length from hours to weeks see</w:t>
       </w:r>
     </w:p>
     <w:p>
@@ -7573,7 +7590,7 @@
       <w:r>
         <w:t xml:space="preserve"> </w:t>
       </w:r>
-      <w:hyperlink r:id="rId120">
+      <w:hyperlink r:id="rId121">
         <w:r>
           <w:rPr>
             <w:rStyle w:val="Hyperlink"/>
@@ -7591,12 +7608,12 @@
         </w:numPr>
       </w:pPr>
       <w:r>
-        <w:t xml:space="preserve">and</w:t>
-      </w:r>
-      <w:r>
-        <w:t xml:space="preserve"> </w:t>
-      </w:r>
-      <w:hyperlink r:id="rId121">
+        <w:t xml:space="preserve">higherin</w:t>
+      </w:r>
+      <w:r>
+        <w:t xml:space="preserve"> </w:t>
+      </w:r>
+      <w:hyperlink r:id="rId122">
         <w:r>
           <w:rPr>
             <w:rStyle w:val="Hyperlink"/>
@@ -7619,7 +7636,7 @@
       <w:r>
         <w:t xml:space="preserve"> </w:t>
       </w:r>
-      <w:hyperlink r:id="rId122">
+      <w:hyperlink r:id="rId123">
         <w:r>
           <w:rPr>
             <w:rStyle w:val="Hyperlink"/>
@@ -7637,17 +7654,17 @@
         </w:numPr>
       </w:pPr>
       <w:r>
-        <w:t xml:space="preserve">Forage</w:t>
-      </w:r>
-      <w:r>
-        <w:t xml:space="preserve"> </w:t>
-      </w:r>
-      <w:hyperlink r:id="rId123">
+        <w:t xml:space="preserve">The Forage</w:t>
+      </w:r>
+      <w:r>
+        <w:t xml:space="preserve"> </w:t>
+      </w:r>
+      <w:hyperlink r:id="rId124">
         <w:r>
           <w:rPr>
             <w:rStyle w:val="Hyperlink"/>
           </w:rPr>
-          <w:t xml:space="preserve">theforage.com/</w:t>
+          <w:t xml:space="preserve">theforage.com</w:t>
         </w:r>
       </w:hyperlink>
     </w:p>
@@ -7689,7 +7706,7 @@
       <w:r>
         <w:t xml:space="preserve"> </w:t>
       </w:r>
-      <w:hyperlink r:id="rId124">
+      <w:hyperlink r:id="rId125">
         <w:r>
           <w:rPr>
             <w:rStyle w:val="Hyperlink"/>
@@ -7725,6 +7742,29 @@
         </w:numPr>
       </w:pPr>
       <w:r>
+        <w:t xml:space="preserve">The Wednesday Waggle</w:t>
+      </w:r>
+      <w:r>
+        <w:t xml:space="preserve"> </w:t>
+      </w:r>
+      <w:hyperlink r:id="rId126">
+        <w:r>
+          <w:rPr>
+            <w:rStyle w:val="Hyperlink"/>
+          </w:rPr>
+          <w:t xml:space="preserve">waggle.cs.manchester.ac.uk</w:t>
+        </w:r>
+      </w:hyperlink>
+    </w:p>
+    <w:p>
+      <w:pPr>
+        <w:pStyle w:val="Compact"/>
+        <w:numPr>
+          <w:ilvl w:val="1"/>
+          <w:numId w:val="1011"/>
+        </w:numPr>
+      </w:pPr>
+      <w:r>
         <w:t xml:space="preserve">the chapter on</w:t>
       </w:r>
       <w:r>
@@ -7746,7 +7786,7 @@
       <w:r>
         <w:t xml:space="preserve"> </w:t>
       </w:r>
-      <w:hyperlink r:id="rId125">
+      <w:hyperlink r:id="rId127">
         <w:r>
           <w:rPr>
             <w:rStyle w:val="Hyperlink"/>
@@ -7794,8 +7834,8 @@
         <w:t xml:space="preserve">for other places you can look</w:t>
       </w:r>
     </w:p>
-    <w:bookmarkEnd w:id="126"/>
-    <w:bookmarkStart w:id="128" w:name="afterfirst"/>
+    <w:bookmarkEnd w:id="128"/>
+    <w:bookmarkStart w:id="130" w:name="afterfirst"/>
     <w:p>
       <w:pPr>
         <w:pStyle w:val="Heading3"/>
@@ -7851,7 +7891,7 @@
       <w:r>
         <w:t xml:space="preserve"> </w:t>
       </w:r>
-      <w:hyperlink r:id="rId127">
+      <w:hyperlink r:id="rId129">
         <w:r>
           <w:rPr>
             <w:rStyle w:val="Hyperlink"/>
@@ -7923,12 +7963,12 @@
         <w:pStyle w:val="FirstParagraph"/>
       </w:pPr>
       <w:r>
-        <w:t xml:space="preserve">Any time you invest in creating a convincing CV will pay off in the long run. Yes, you’ve only just started University, so might not have much to talk about just yet, but it’s never too early to make a start and it will help you identify where the gaps are.</w:t>
-      </w:r>
-    </w:p>
-    <w:bookmarkEnd w:id="128"/>
-    <w:bookmarkEnd w:id="129"/>
-    <w:bookmarkStart w:id="130" w:name="ex5"/>
+        <w:t xml:space="preserve">Any time you invest in creating a convincing CV will pay off in the long run. Yes, you’ve only just started University, so might not have much to talk about just yet, but it’s never too early to make a start and it will help you identify where the gaps are at a time when you can do something about filling them.</w:t>
+      </w:r>
+    </w:p>
+    <w:bookmarkEnd w:id="130"/>
+    <w:bookmarkEnd w:id="131"/>
+    <w:bookmarkStart w:id="132" w:name="ex5"/>
     <w:p>
       <w:pPr>
         <w:pStyle w:val="Heading2"/>
@@ -8089,7 +8129,7 @@
       <w:r>
         <w:t xml:space="preserve"> </w:t>
       </w:r>
-      <w:hyperlink r:id="rId119">
+      <w:hyperlink r:id="rId120">
         <w:r>
           <w:rPr>
             <w:rStyle w:val="Hyperlink"/>
@@ -8101,8 +8141,8 @@
         <w:t xml:space="preserve">. Have a good look around, there are over 600 templates to choose from.</w:t>
       </w:r>
     </w:p>
-    <w:bookmarkEnd w:id="130"/>
-    <w:bookmarkStart w:id="132" w:name="weird"/>
+    <w:bookmarkEnd w:id="132"/>
+    <w:bookmarkStart w:id="134" w:name="weird"/>
     <w:p>
       <w:pPr>
         <w:pStyle w:val="Heading2"/>
@@ -8130,7 +8170,7 @@
       <w:r>
         <w:t xml:space="preserve"> </w:t>
       </w:r>
-      <w:hyperlink r:id="rId131">
+      <w:hyperlink r:id="rId133">
         <w:r>
           <w:rPr>
             <w:rStyle w:val="Hyperlink"/>
@@ -8198,8 +8238,8 @@
         <w:t xml:space="preserve">{cdyf.me}}}</w:t>
       </w:r>
     </w:p>
-    <w:bookmarkEnd w:id="132"/>
-    <w:bookmarkStart w:id="138" w:name="debugging-your-cv-checklist"/>
+    <w:bookmarkEnd w:id="134"/>
+    <w:bookmarkStart w:id="140" w:name="debugging-your-cv-checklist"/>
     <w:p>
       <w:pPr>
         <w:pStyle w:val="Heading2"/>
@@ -8315,7 +8355,7 @@
       <w:r>
         <w:t xml:space="preserve"> </w:t>
       </w:r>
-      <w:hyperlink r:id="rId133">
+      <w:hyperlink r:id="rId135">
         <w:r>
           <w:rPr>
             <w:rStyle w:val="Hyperlink"/>
@@ -8386,7 +8426,7 @@
       <w:r>
         <w:t xml:space="preserve"> </w:t>
       </w:r>
-      <w:hyperlink r:id="rId134">
+      <w:hyperlink r:id="rId136">
         <w:r>
           <w:rPr>
             <w:rStyle w:val="Hyperlink"/>
@@ -8400,7 +8440,7 @@
       <w:r>
         <w:t xml:space="preserve"> </w:t>
       </w:r>
-      <w:hyperlink r:id="rId135">
+      <w:hyperlink r:id="rId137">
         <w:r>
           <w:rPr>
             <w:rStyle w:val="Hyperlink"/>
@@ -8445,7 +8485,7 @@
       <w:r>
         <w:t xml:space="preserve"> </w:t>
       </w:r>
-      <w:hyperlink r:id="rId136">
+      <w:hyperlink r:id="rId138">
         <w:r>
           <w:rPr>
             <w:rStyle w:val="Hyperlink"/>
@@ -8485,7 +8525,7 @@
       <w:r>
         <w:t xml:space="preserve"> </w:t>
       </w:r>
-      <w:hyperlink r:id="rId137">
+      <w:hyperlink r:id="rId139">
         <w:r>
           <w:rPr>
             <w:rStyle w:val="Hyperlink"/>
@@ -8494,8 +8534,8 @@
         </w:r>
       </w:hyperlink>
     </w:p>
-    <w:bookmarkEnd w:id="138"/>
-    <w:bookmarkStart w:id="139" w:name="cvconc"/>
+    <w:bookmarkEnd w:id="140"/>
+    <w:bookmarkStart w:id="142" w:name="cvconc"/>
     <w:p>
       <w:pPr>
         <w:pStyle w:val="Heading2"/>
@@ -8554,8 +8594,19 @@
         </w:numPr>
       </w:pPr>
       <w:r>
-        <w:t xml:space="preserve">your individual COMP101 coursework (see blackboard)</w:t>
-      </w:r>
+        <w:t xml:space="preserve">your individual COMP101 coursework, see</w:t>
+      </w:r>
+      <w:r>
+        <w:t xml:space="preserve"> </w:t>
+      </w:r>
+      <w:hyperlink r:id="rId141">
+        <w:r>
+          <w:rPr>
+            <w:rStyle w:val="Hyperlink"/>
+          </w:rPr>
+          <w:t xml:space="preserve">canvas.manchester.ac.uk</w:t>
+        </w:r>
+      </w:hyperlink>
     </w:p>
     <w:p>
       <w:pPr>
@@ -8589,9 +8640,9 @@
         <w:t xml:space="preserve">…and more.</w:t>
       </w:r>
     </w:p>
-    <w:bookmarkEnd w:id="139"/>
-    <w:bookmarkEnd w:id="140"/>
-    <w:bookmarkStart w:id="141" w:name="appendix"/>
+    <w:bookmarkEnd w:id="142"/>
+    <w:bookmarkEnd w:id="143"/>
+    <w:bookmarkStart w:id="144" w:name="appendix"/>
     <w:p>
       <w:pPr>
         <w:pStyle w:val="Heading1"/>
@@ -8600,8 +8651,8 @@
         <w:t xml:space="preserve">Appendix</w:t>
       </w:r>
     </w:p>
-    <w:bookmarkEnd w:id="141"/>
-    <w:bookmarkStart w:id="166" w:name="typography"/>
+    <w:bookmarkEnd w:id="144"/>
+    <w:bookmarkStart w:id="169" w:name="typography"/>
     <w:p>
       <w:pPr>
         <w:pStyle w:val="Heading1"/>
@@ -8629,7 +8680,7 @@
       <w:r>
         <w:t xml:space="preserve"> </w:t>
       </w:r>
-      <w:hyperlink r:id="rId142">
+      <w:hyperlink r:id="rId145">
         <w:r>
           <w:rPr>
             <w:rStyle w:val="Hyperlink"/>
@@ -8646,7 +8697,7 @@
       <w:r>
         <w:t xml:space="preserve"> </w:t>
       </w:r>
-      <w:hyperlink r:id="rId143">
+      <w:hyperlink r:id="rId146">
         <w:r>
           <w:rPr>
             <w:rStyle w:val="Hyperlink"/>
@@ -8661,8 +8712,8 @@
         <w:t xml:space="preserve">etc.</w:t>
       </w:r>
     </w:p>
-    <w:bookmarkStart w:id="165" w:name="refs"/>
-    <w:bookmarkStart w:id="145" w:name="ref-googlescholar"/>
+    <w:bookmarkStart w:id="168" w:name="refs"/>
+    <w:bookmarkStart w:id="148" w:name="ref-googlescholar"/>
     <w:p>
       <w:pPr>
         <w:pStyle w:val="Bibliography"/>
@@ -8714,7 +8765,7 @@
       <w:r>
         <w:t xml:space="preserve"> </w:t>
       </w:r>
-      <w:hyperlink r:id="rId144">
+      <w:hyperlink r:id="rId147">
         <w:r>
           <w:rPr>
             <w:rStyle w:val="Hyperlink"/>
@@ -8726,8 +8777,8 @@
         <w:t xml:space="preserve">.</w:t>
       </w:r>
     </w:p>
-    <w:bookmarkEnd w:id="145"/>
-    <w:bookmarkStart w:id="147" w:name="ref-codinghorror"/>
+    <w:bookmarkEnd w:id="148"/>
+    <w:bookmarkStart w:id="150" w:name="ref-codinghorror"/>
     <w:p>
       <w:pPr>
         <w:pStyle w:val="Bibliography"/>
@@ -8842,7 +8893,7 @@
       <w:r>
         <w:t xml:space="preserve"> </w:t>
       </w:r>
-      <w:hyperlink r:id="rId146">
+      <w:hyperlink r:id="rId149">
         <w:r>
           <w:rPr>
             <w:rStyle w:val="Hyperlink"/>
@@ -8854,8 +8905,8 @@
         <w:t xml:space="preserve">.</w:t>
       </w:r>
     </w:p>
-    <w:bookmarkEnd w:id="147"/>
-    <w:bookmarkStart w:id="149" w:name="ref-turingomnibus"/>
+    <w:bookmarkEnd w:id="150"/>
+    <w:bookmarkStart w:id="152" w:name="ref-turingomnibus"/>
     <w:p>
       <w:pPr>
         <w:pStyle w:val="Bibliography"/>
@@ -8956,7 +9007,7 @@
       <w:r>
         <w:t xml:space="preserve"> </w:t>
       </w:r>
-      <w:hyperlink r:id="rId148">
+      <w:hyperlink r:id="rId151">
         <w:r>
           <w:rPr>
             <w:rStyle w:val="Hyperlink"/>
@@ -8968,8 +9019,8 @@
         <w:t xml:space="preserve">.</w:t>
       </w:r>
     </w:p>
-    <w:bookmarkEnd w:id="149"/>
-    <w:bookmarkStart w:id="151" w:name="ref-debugyourfuture"/>
+    <w:bookmarkEnd w:id="152"/>
+    <w:bookmarkStart w:id="154" w:name="ref-debugyourfuture"/>
     <w:p>
       <w:pPr>
         <w:pStyle w:val="Bibliography"/>
@@ -9017,7 +9068,7 @@
       <w:r>
         <w:t xml:space="preserve"> </w:t>
       </w:r>
-      <w:hyperlink r:id="rId150">
+      <w:hyperlink r:id="rId153">
         <w:r>
           <w:rPr>
             <w:rStyle w:val="Hyperlink"/>
@@ -9029,8 +9080,8 @@
         <w:t xml:space="preserve">.</w:t>
       </w:r>
     </w:p>
-    <w:bookmarkEnd w:id="151"/>
-    <w:bookmarkStart w:id="152" w:name="ref-findingyourfuture"/>
+    <w:bookmarkEnd w:id="154"/>
+    <w:bookmarkStart w:id="155" w:name="ref-findingyourfuture"/>
     <w:p>
       <w:pPr>
         <w:pStyle w:val="Bibliography"/>
@@ -9162,7 +9213,7 @@
       <w:r>
         <w:t xml:space="preserve"> </w:t>
       </w:r>
-      <w:hyperlink r:id="rId125">
+      <w:hyperlink r:id="rId127">
         <w:r>
           <w:rPr>
             <w:rStyle w:val="Hyperlink"/>
@@ -9174,8 +9225,8 @@
         <w:t xml:space="preserve">.</w:t>
       </w:r>
     </w:p>
-    <w:bookmarkEnd w:id="152"/>
-    <w:bookmarkStart w:id="154" w:name="ref-knuth"/>
+    <w:bookmarkEnd w:id="155"/>
+    <w:bookmarkStart w:id="157" w:name="ref-knuth"/>
     <w:p>
       <w:pPr>
         <w:pStyle w:val="Bibliography"/>
@@ -9213,7 +9264,7 @@
       <w:r>
         <w:t xml:space="preserve"> </w:t>
       </w:r>
-      <w:hyperlink r:id="rId153">
+      <w:hyperlink r:id="rId156">
         <w:r>
           <w:rPr>
             <w:rStyle w:val="Hyperlink"/>
@@ -9225,8 +9276,8 @@
         <w:t xml:space="preserve">.</w:t>
       </w:r>
     </w:p>
-    <w:bookmarkEnd w:id="154"/>
-    <w:bookmarkStart w:id="156" w:name="ref-kopka"/>
+    <w:bookmarkEnd w:id="157"/>
+    <w:bookmarkStart w:id="159" w:name="ref-kopka"/>
     <w:p>
       <w:pPr>
         <w:pStyle w:val="Bibliography"/>
@@ -9264,7 +9315,7 @@
       <w:r>
         <w:t xml:space="preserve"> </w:t>
       </w:r>
-      <w:hyperlink r:id="rId155">
+      <w:hyperlink r:id="rId158">
         <w:r>
           <w:rPr>
             <w:rStyle w:val="Hyperlink"/>
@@ -9276,8 +9327,8 @@
         <w:t xml:space="preserve">.</w:t>
       </w:r>
     </w:p>
-    <w:bookmarkEnd w:id="156"/>
-    <w:bookmarkStart w:id="158" w:name="ref-yoda"/>
+    <w:bookmarkEnd w:id="159"/>
+    <w:bookmarkStart w:id="161" w:name="ref-yoda"/>
     <w:p>
       <w:pPr>
         <w:pStyle w:val="Bibliography"/>
@@ -9316,7 +9367,7 @@
       <w:r>
         <w:t xml:space="preserve"> </w:t>
       </w:r>
-      <w:hyperlink r:id="rId157">
+      <w:hyperlink r:id="rId160">
         <w:r>
           <w:rPr>
             <w:rStyle w:val="Hyperlink"/>
@@ -9328,8 +9379,8 @@
         <w:t xml:space="preserve">.</w:t>
       </w:r>
     </w:p>
-    <w:bookmarkEnd w:id="158"/>
-    <w:bookmarkStart w:id="160" w:name="ref-latexproject"/>
+    <w:bookmarkEnd w:id="161"/>
+    <w:bookmarkStart w:id="163" w:name="ref-latexproject"/>
     <w:p>
       <w:pPr>
         <w:pStyle w:val="Bibliography"/>
@@ -9367,7 +9418,7 @@
       <w:r>
         <w:t xml:space="preserve"> </w:t>
       </w:r>
-      <w:hyperlink r:id="rId159">
+      <w:hyperlink r:id="rId162">
         <w:r>
           <w:rPr>
             <w:rStyle w:val="Hyperlink"/>
@@ -9379,8 +9430,8 @@
         <w:t xml:space="preserve">.</w:t>
       </w:r>
     </w:p>
-    <w:bookmarkEnd w:id="160"/>
-    <w:bookmarkStart w:id="162" w:name="ref-turing"/>
+    <w:bookmarkEnd w:id="163"/>
+    <w:bookmarkStart w:id="165" w:name="ref-turing"/>
     <w:p>
       <w:pPr>
         <w:pStyle w:val="Bibliography"/>
@@ -9413,7 +9464,7 @@
       <w:r>
         <w:t xml:space="preserve"> </w:t>
       </w:r>
-      <w:hyperlink r:id="rId161">
+      <w:hyperlink r:id="rId164">
         <w:r>
           <w:rPr>
             <w:rStyle w:val="Hyperlink"/>
@@ -9425,8 +9476,8 @@
         <w:t xml:space="preserve">.</w:t>
       </w:r>
     </w:p>
-    <w:bookmarkEnd w:id="162"/>
-    <w:bookmarkStart w:id="164" w:name="ref-turing50"/>
+    <w:bookmarkEnd w:id="165"/>
+    <w:bookmarkStart w:id="167" w:name="ref-turing50"/>
     <w:p>
       <w:pPr>
         <w:pStyle w:val="Bibliography"/>
@@ -9495,7 +9546,7 @@
       <w:r>
         <w:t xml:space="preserve"> </w:t>
       </w:r>
-      <w:hyperlink r:id="rId163">
+      <w:hyperlink r:id="rId166">
         <w:r>
           <w:rPr>
             <w:rStyle w:val="Hyperlink"/>
@@ -9507,9 +9558,9 @@
         <w:t xml:space="preserve">.</w:t>
       </w:r>
     </w:p>
-    <w:bookmarkEnd w:id="164"/>
-    <w:bookmarkEnd w:id="165"/>
-    <w:bookmarkEnd w:id="166"/>
+    <w:bookmarkEnd w:id="167"/>
+    <w:bookmarkEnd w:id="168"/>
+    <w:bookmarkEnd w:id="169"/>
     <w:sectPr>
       <w:footnotePr>
         <w:numRestart w:val="eachSect"/>
@@ -9539,7 +9590,7 @@
       </w:r>
     </w:p>
   </w:footnote>
-  <w:footnote w:id="44">
+  <w:footnote w:id="45">
     <w:p>
       <w:pPr>
         <w:pStyle w:val="FootnoteText"/>
@@ -9559,7 +9610,7 @@
       <w:r>
         <w:t xml:space="preserve"> </w:t>
       </w:r>
-      <w:hyperlink r:id="rId45">
+      <w:hyperlink r:id="rId46">
         <w:r>
           <w:rPr>
             <w:rStyle w:val="Hyperlink"/>
@@ -9573,7 +9624,7 @@
       <w:r>
         <w:t xml:space="preserve"> </w:t>
       </w:r>
-      <w:hyperlink r:id="rId46">
+      <w:hyperlink r:id="rId47">
         <w:r>
           <w:rPr>
             <w:rStyle w:val="Hyperlink"/>
@@ -9590,7 +9641,7 @@
       <w:r>
         <w:t xml:space="preserve"> </w:t>
       </w:r>
-      <w:hyperlink r:id="rId47">
+      <w:hyperlink r:id="rId48">
         <w:r>
           <w:rPr>
             <w:rStyle w:val="Hyperlink"/>
@@ -9606,7 +9657,7 @@
       </w:r>
     </w:p>
   </w:footnote>
-  <w:footnote w:id="48">
+  <w:footnote w:id="49">
     <w:p>
       <w:pPr>
         <w:pStyle w:val="FootnoteText"/>
@@ -9620,7 +9671,7 @@
       <w:r>
         <w:t xml:space="preserve"> </w:t>
       </w:r>
-      <w:hyperlink r:id="rId49">
+      <w:hyperlink r:id="rId50">
         <w:r>
           <w:rPr>
             <w:rStyle w:val="Hyperlink"/>
@@ -9630,7 +9681,7 @@
       </w:hyperlink>
     </w:p>
   </w:footnote>
-  <w:footnote w:id="58">
+  <w:footnote w:id="59">
     <w:p>
       <w:pPr>
         <w:pStyle w:val="FootnoteText"/>
@@ -9646,25 +9697,6 @@
       </w:r>
       <w:r>
         <w:t xml:space="preserve">Microsoft Word, Google Docs etc</w:t>
-      </w:r>
-    </w:p>
-  </w:footnote>
-  <w:footnote w:id="78">
-    <w:p>
-      <w:pPr>
-        <w:pStyle w:val="FootnoteText"/>
-      </w:pPr>
-      <w:r>
-        <w:rPr>
-          <w:rStyle w:val="FootnoteReference"/>
-        </w:rPr>
-        <w:footnoteRef/>
-      </w:r>
-      <w:r>
-        <w:t xml:space="preserve"> </w:t>
-      </w:r>
-      <w:r>
-        <w:t xml:space="preserve">This is a footnote about footnotes. Very meta.</w:t>
       </w:r>
     </w:p>
   </w:footnote>
@@ -9683,12 +9715,31 @@
         <w:t xml:space="preserve"> </w:t>
       </w:r>
       <w:r>
+        <w:t xml:space="preserve">This is a footnote about footnotes. Very meta.</w:t>
+      </w:r>
+    </w:p>
+  </w:footnote>
+  <w:footnote w:id="80">
+    <w:p>
+      <w:pPr>
+        <w:pStyle w:val="FootnoteText"/>
+      </w:pPr>
+      <w:r>
+        <w:rPr>
+          <w:rStyle w:val="FootnoteReference"/>
+        </w:rPr>
+        <w:footnoteRef/>
+      </w:r>
+      <w:r>
+        <w:t xml:space="preserve"> </w:t>
+      </w:r>
+      <w:r>
         <w:t xml:space="preserve">BibTeX entries for journal articles can be automatically generated from persistent identifiers known as</w:t>
       </w:r>
       <w:r>
         <w:t xml:space="preserve"> </w:t>
       </w:r>
-      <w:hyperlink r:id="rId80">
+      <w:hyperlink r:id="rId81">
         <w:r>
           <w:rPr>
             <w:rStyle w:val="Hyperlink"/>
@@ -9705,7 +9756,7 @@
       <w:r>
         <w:t xml:space="preserve"> </w:t>
       </w:r>
-      <w:hyperlink r:id="rId81">
+      <w:hyperlink r:id="rId82">
         <w:r>
           <w:rPr>
             <w:rStyle w:val="Hyperlink"/>
@@ -9721,7 +9772,7 @@
       </w:r>
     </w:p>
   </w:footnote>
-  <w:footnote w:id="82">
+  <w:footnote w:id="83">
     <w:p>
       <w:pPr>
         <w:pStyle w:val="FootnoteText"/>
@@ -9741,7 +9792,7 @@
       <w:r>
         <w:t xml:space="preserve"> </w:t>
       </w:r>
-      <w:hyperlink r:id="rId83">
+      <w:hyperlink r:id="rId84">
         <w:r>
           <w:rPr>
             <w:rStyle w:val="Hyperlink"/>
@@ -9751,7 +9802,7 @@
       </w:hyperlink>
     </w:p>
   </w:footnote>
-  <w:footnote w:id="103">
+  <w:footnote w:id="104">
     <w:p>
       <w:pPr>
         <w:pStyle w:val="FootnoteText"/>
@@ -9771,7 +9822,7 @@
       <w:r>
         <w:t xml:space="preserve"> </w:t>
       </w:r>
-      <w:hyperlink r:id="rId104">
+      <w:hyperlink r:id="rId105">
         <w:r>
           <w:rPr>
             <w:rStyle w:val="Hyperlink"/>
@@ -9788,7 +9839,7 @@
       <w:r>
         <w:t xml:space="preserve"> </w:t>
       </w:r>
-      <w:hyperlink r:id="rId105">
+      <w:hyperlink r:id="rId106">
         <w:r>
           <w:rPr>
             <w:rStyle w:val="Hyperlink"/>
@@ -9804,7 +9855,7 @@
       </w:r>
     </w:p>
   </w:footnote>
-  <w:footnote w:id="106">
+  <w:footnote w:id="107">
     <w:p>
       <w:pPr>
         <w:pStyle w:val="FootnoteText"/>
@@ -9818,7 +9869,7 @@
       <w:r>
         <w:t xml:space="preserve"> </w:t>
       </w:r>
-      <w:hyperlink r:id="rId107">
+      <w:hyperlink r:id="rId108">
         <w:r>
           <w:rPr>
             <w:rStyle w:val="Hyperlink"/>
@@ -9828,7 +9879,7 @@
       </w:hyperlink>
     </w:p>
   </w:footnote>
-  <w:footnote w:id="113">
+  <w:footnote w:id="114">
     <w:p>
       <w:pPr>
         <w:pStyle w:val="FootnoteText"/>

</xml_diff>